<commit_message>
Add reviewer-friendly schematic options (lanes and stack layouts)
Adds the simplified two-layout schematic with a two-part takeaway table
covering genotype harmonization and GWAS; README now embeds the portrait
option.

Co-Authored-By: Claude Fable 5.1 <noreply@anthropic.com>
Claude-Session: https://claude.ai/code/session_018QsH3eLkvymJ4uH9sH99fS
</commit_message>
<xml_diff>
--- a/docs/figures/pipeline_schematic_figure.docx
+++ b/docs/figures/pipeline_schematic_figure.docx
@@ -3,22 +3,26 @@
 <w:document xmlns:wpc="http://schemas.microsoft.com/office/word/2010/wordprocessingCanvas" xmlns:mo="http://schemas.microsoft.com/office/mac/office/2008/main" xmlns:mc="http://schemas.openxmlformats.org/markup-compatibility/2006" xmlns:mv="urn:schemas-microsoft-com:mac:vml" xmlns:o="urn:schemas-microsoft-com:office:office" xmlns:r="http://schemas.openxmlformats.org/officeDocument/2006/relationships" xmlns:m="http://schemas.openxmlformats.org/officeDocument/2006/math" xmlns:v="urn:schemas-microsoft-com:vml" xmlns:wp14="http://schemas.microsoft.com/office/word/2010/wordprocessingDrawing" xmlns:wp="http://schemas.openxmlformats.org/drawingml/2006/wordprocessingDrawing" xmlns:w10="urn:schemas-microsoft-com:office:word" xmlns:w="http://schemas.openxmlformats.org/wordprocessingml/2006/main" xmlns:w14="http://schemas.microsoft.com/office/word/2010/wordml" xmlns:wpg="http://schemas.microsoft.com/office/word/2010/wordprocessingGroup" xmlns:wpi="http://schemas.microsoft.com/office/word/2010/wordprocessingInk" xmlns:wne="http://schemas.microsoft.com/office/word/2006/wordml" xmlns:wps="http://schemas.microsoft.com/office/word/2010/wordprocessingShape" mc:Ignorable="w14 wp14">
   <w:body>
     <w:p>
+      <w:pPr>
+        <w:pStyle w:val="Heading1"/>
+      </w:pPr>
       <w:r>
-        <w:rPr>
-          <w:b/>
-          <w:sz w:val="20"/>
-        </w:rPr>
-        <w:t>Figure 1, compact version (Panels A–C), recommended when the figure shares a page with text</w:t>
+        <w:t>Pipeline schematic: key-takeaways options</w:t>
       </w:r>
     </w:p>
     <w:p>
-      <w:pPr>
-        <w:jc w:val="center"/>
-      </w:pPr>
+      <w:r>
+        <w:rPr>
+          <w:sz w:val="18"/>
+        </w:rPr>
+        <w:t>Option 2 (portrait). Full-width at 7.5 in; body text about 6 pt.</w:t>
+      </w:r>
+    </w:p>
+    <w:p>
       <w:r>
         <w:drawing>
           <wp:inline xmlns:a="http://schemas.openxmlformats.org/drawingml/2006/main" xmlns:pic="http://schemas.openxmlformats.org/drawingml/2006/picture">
-            <wp:extent cx="6858000" cy="7558162"/>
+            <wp:extent cx="6400800" cy="6476202"/>
             <wp:docPr id="1" name="Picture 1"/>
             <wp:cNvGraphicFramePr>
               <a:graphicFrameLocks noChangeAspect="1"/>
@@ -27,7 +31,7 @@
               <a:graphicData uri="http://schemas.openxmlformats.org/drawingml/2006/picture">
                 <pic:pic>
                   <pic:nvPicPr>
-                    <pic:cNvPr id="0" name="pipeline_schematic_compact.png"/>
+                    <pic:cNvPr id="0" name="pipeline_schematic_stack.png"/>
                     <pic:cNvPicPr/>
                   </pic:nvPicPr>
                   <pic:blipFill>
@@ -39,7 +43,7 @@
                   <pic:spPr>
                     <a:xfrm>
                       <a:off x="0" y="0"/>
-                      <a:ext cx="6858000" cy="7558162"/>
+                      <a:ext cx="6400800" cy="6476202"/>
                     </a:xfrm>
                     <a:prstGeom prst="rect"/>
                   </pic:spPr>
@@ -54,6 +58,403 @@
       <w:pPr>
         <w:spacing w:after="120"/>
       </w:pPr>
+      <w:r>
+        <w:rPr>
+          <w:sz w:val="18"/>
+        </w:rPr>
+      </w:r>
+      <w:r>
+        <w:rPr>
+          <w:b/>
+          <w:sz w:val="18"/>
+        </w:rPr>
+        <w:t>Figure 1. A modular, ancestry-aware framework for genotype harmonization and GWAS.</w:t>
+      </w:r>
+      <w:r>
+        <w:rPr>
+          <w:sz w:val="18"/>
+        </w:rPr>
+      </w:r>
+    </w:p>
+    <w:p>
+      <w:pPr>
+        <w:spacing w:after="120"/>
+      </w:pPr>
+      <w:r>
+        <w:rPr>
+          <w:sz w:val="18"/>
+        </w:rPr>
+      </w:r>
+      <w:r>
+        <w:rPr>
+          <w:b/>
+          <w:sz w:val="18"/>
+        </w:rPr>
+        <w:t>(A)</w:t>
+      </w:r>
+      <w:r>
+        <w:rPr>
+          <w:sz w:val="18"/>
+        </w:rPr>
+        <w:t xml:space="preserve"> Genotype harmonization, QC and ancestry inference (Nextflow_Genotype_Pipeline, modules M0–M8). Genotypes from multiple arrays, batches and genome builds are lifted over, aligned and UNION-merged, imputed on the TOPMed, Michigan and All of Us servers through automated job handling, filtered with the ancestry-aware MagicalRsq-X metric instead of a fixed R² cut-off, intersection-merged and optionally re-imputed, and passed through final QC. Global ancestry (GRAF-anc) and local ancestry tracts (RFMix) are inferred, and an optional benchmarking module compares imputed genotypes with whole-genome sequencing truth and simulates GWAS power by ancestry (insets illustrative).</w:t>
+      </w:r>
+    </w:p>
+    <w:p>
+      <w:pPr>
+        <w:spacing w:after="120"/>
+      </w:pPr>
+      <w:r>
+        <w:rPr>
+          <w:sz w:val="18"/>
+        </w:rPr>
+      </w:r>
+      <w:r>
+        <w:rPr>
+          <w:b/>
+          <w:sz w:val="18"/>
+        </w:rPr>
+        <w:t>(B)</w:t>
+      </w:r>
+      <w:r>
+        <w:rPr>
+          <w:sz w:val="18"/>
+        </w:rPr>
+        <w:t xml:space="preserve"> Ancestry-aware GWAS and downstream analyses (Nextflow_GWAS_pipeline). Harmonized genotypes and ancestry calls are stratified into continental and admixed groups and analysed in parallel per ancestry and trait (REGENIE, SAIGE, GENESIS), with Tractor decomposing effects by local ancestry in African American and Latin American participants and time-to-event GWAS that incorporates local ancestry (GENESIS extension). Group results are combined by MR-MEGA / MR-MEGA-env meta-regression, which models ancestry-aware and cohort-specific heterogeneity, fine-mapped within ancestry (PolyFun + SuSiE) and across traits and ancestries (MG-FLASH-FM for related traits), and carried into ancestry-aware polygenic scores, heritability, colocalization with diverse QTL resources and functional annotation.</w:t>
+      </w:r>
+    </w:p>
+    <w:p>
+      <w:pPr>
+        <w:spacing w:after="120"/>
+      </w:pPr>
+      <w:r>
+        <w:rPr>
+          <w:sz w:val="18"/>
+        </w:rPr>
+      </w:r>
+      <w:r>
+        <w:rPr>
+          <w:b/>
+          <w:sz w:val="18"/>
+        </w:rPr>
+        <w:t>(C)</w:t>
+      </w:r>
+      <w:r>
+        <w:rPr>
+          <w:sz w:val="18"/>
+        </w:rPr>
+        <w:t xml:space="preserve"> Key differences from a typical GWAS workflow. Every module is an independent Nextflow entry point, so the framework runs end to end or module by module; dashed outlines mark optional modules and orange marks admixed-population methods.</w:t>
+      </w:r>
+    </w:p>
+    <w:p>
+      <w:r>
+        <w:br w:type="page"/>
+      </w:r>
+    </w:p>
+    <w:p>
+      <w:pPr>
+        <w:sectPr>
+          <w:pgSz w:w="12240" w:h="15840"/>
+          <w:pgMar w:top="1080" w:right="1080" w:bottom="1080" w:left="1080" w:header="720" w:footer="720" w:gutter="0"/>
+          <w:cols w:space="720"/>
+          <w:docGrid w:linePitch="360"/>
+        </w:sectPr>
+      </w:pPr>
+    </w:p>
+    <w:p>
+      <w:r>
+        <w:rPr>
+          <w:sz w:val="18"/>
+        </w:rPr>
+        <w:t>Option 1 (landscape). Full-width at 9.5 in.</w:t>
+      </w:r>
+    </w:p>
+    <w:p>
+      <w:r>
+        <w:drawing>
+          <wp:inline xmlns:a="http://schemas.openxmlformats.org/drawingml/2006/main" xmlns:pic="http://schemas.openxmlformats.org/drawingml/2006/picture">
+            <wp:extent cx="8686800" cy="5077435"/>
+            <wp:docPr id="2" name="Picture 2"/>
+            <wp:cNvGraphicFramePr>
+              <a:graphicFrameLocks noChangeAspect="1"/>
+            </wp:cNvGraphicFramePr>
+            <a:graphic>
+              <a:graphicData uri="http://schemas.openxmlformats.org/drawingml/2006/picture">
+                <pic:pic>
+                  <pic:nvPicPr>
+                    <pic:cNvPr id="0" name="pipeline_schematic_lanes.png"/>
+                    <pic:cNvPicPr/>
+                  </pic:nvPicPr>
+                  <pic:blipFill>
+                    <a:blip r:embed="rId10"/>
+                    <a:stretch>
+                      <a:fillRect/>
+                    </a:stretch>
+                  </pic:blipFill>
+                  <pic:spPr>
+                    <a:xfrm>
+                      <a:off x="0" y="0"/>
+                      <a:ext cx="8686800" cy="5077435"/>
+                    </a:xfrm>
+                    <a:prstGeom prst="rect"/>
+                  </pic:spPr>
+                </pic:pic>
+              </a:graphicData>
+            </a:graphic>
+          </wp:inline>
+        </w:drawing>
+      </w:r>
+    </w:p>
+    <w:p>
+      <w:pPr>
+        <w:spacing w:after="120"/>
+      </w:pPr>
+      <w:r>
+        <w:rPr>
+          <w:sz w:val="18"/>
+        </w:rPr>
+      </w:r>
+      <w:r>
+        <w:rPr>
+          <w:b/>
+          <w:sz w:val="18"/>
+        </w:rPr>
+        <w:t>Figure 1. A modular, ancestry-aware framework for genotype harmonization and GWAS.</w:t>
+      </w:r>
+      <w:r>
+        <w:rPr>
+          <w:sz w:val="18"/>
+        </w:rPr>
+      </w:r>
+    </w:p>
+    <w:p>
+      <w:pPr>
+        <w:spacing w:after="120"/>
+      </w:pPr>
+      <w:r>
+        <w:rPr>
+          <w:sz w:val="18"/>
+        </w:rPr>
+      </w:r>
+      <w:r>
+        <w:rPr>
+          <w:b/>
+          <w:sz w:val="18"/>
+        </w:rPr>
+        <w:t>(A)</w:t>
+      </w:r>
+      <w:r>
+        <w:rPr>
+          <w:sz w:val="18"/>
+        </w:rPr>
+        <w:t xml:space="preserve"> Genotype harmonization, QC and ancestry inference (Nextflow_Genotype_Pipeline, modules M0–M8). Genotypes from multiple arrays, batches and genome builds are lifted over, aligned and UNION-merged, imputed on the TOPMed, Michigan and All of Us servers through automated job handling, filtered with the ancestry-aware MagicalRsq-X metric instead of a fixed R² cut-off, intersection-merged and optionally re-imputed, and passed through final QC. Global ancestry (GRAF-anc) and local ancestry tracts (RFMix) are inferred, and an optional benchmarking module compares imputed genotypes with whole-genome sequencing truth and simulates GWAS power by ancestry (insets illustrative).</w:t>
+      </w:r>
+    </w:p>
+    <w:p>
+      <w:pPr>
+        <w:spacing w:after="120"/>
+      </w:pPr>
+      <w:r>
+        <w:rPr>
+          <w:sz w:val="18"/>
+        </w:rPr>
+      </w:r>
+      <w:r>
+        <w:rPr>
+          <w:b/>
+          <w:sz w:val="18"/>
+        </w:rPr>
+        <w:t>(B)</w:t>
+      </w:r>
+      <w:r>
+        <w:rPr>
+          <w:sz w:val="18"/>
+        </w:rPr>
+        <w:t xml:space="preserve"> Ancestry-aware GWAS and downstream analyses (Nextflow_GWAS_pipeline). Harmonized genotypes and ancestry calls are stratified into continental and admixed groups and analysed in parallel per ancestry and trait (REGENIE, SAIGE, GENESIS), with Tractor decomposing effects by local ancestry in African American and Latin American participants and time-to-event GWAS that incorporates local ancestry (GENESIS extension). Group results are combined by MR-MEGA / MR-MEGA-env meta-regression, which models ancestry-aware and cohort-specific heterogeneity, fine-mapped within ancestry (PolyFun + SuSiE) and across traits and ancestries (MG-FLASH-FM for related traits), and carried into ancestry-aware polygenic scores, heritability, colocalization with diverse QTL resources and functional annotation.</w:t>
+      </w:r>
+    </w:p>
+    <w:p>
+      <w:pPr>
+        <w:spacing w:after="120"/>
+      </w:pPr>
+      <w:r>
+        <w:rPr>
+          <w:sz w:val="18"/>
+        </w:rPr>
+      </w:r>
+      <w:r>
+        <w:rPr>
+          <w:b/>
+          <w:sz w:val="18"/>
+        </w:rPr>
+        <w:t>(C)</w:t>
+      </w:r>
+      <w:r>
+        <w:rPr>
+          <w:sz w:val="18"/>
+        </w:rPr>
+        <w:t xml:space="preserve"> Key differences from a typical GWAS workflow. Every module is an independent Nextflow entry point, so the framework runs end to end or module by module; dashed outlines mark optional modules and orange marks admixed-population methods.</w:t>
+      </w:r>
+    </w:p>
+    <w:p>
+      <w:pPr>
+        <w:sectPr>
+          <w:pgSz w:w="15840" w:h="12240" w:orient="landscape"/>
+          <w:pgMar w:top="1080" w:right="1080" w:bottom="1080" w:left="1080" w:header="720" w:footer="720" w:gutter="0"/>
+          <w:cols w:space="720"/>
+          <w:docGrid w:linePitch="360"/>
+        </w:sectPr>
+      </w:pPr>
+    </w:p>
+    <w:p>
+      <w:pPr>
+        <w:pStyle w:val="Heading1"/>
+      </w:pPr>
+      <w:r>
+        <w:t>Detailed versions (documentation / talks)</w:t>
+      </w:r>
+    </w:p>
+    <w:p>
+      <w:r>
+        <w:rPr>
+          <w:sz w:val="18"/>
+        </w:rPr>
+        <w:t>Compact detailed version (one line per module).</w:t>
+      </w:r>
+    </w:p>
+    <w:p>
+      <w:r>
+        <w:drawing>
+          <wp:inline xmlns:a="http://schemas.openxmlformats.org/drawingml/2006/main" xmlns:pic="http://schemas.openxmlformats.org/drawingml/2006/picture">
+            <wp:extent cx="6400800" cy="7054285"/>
+            <wp:docPr id="3" name="Picture 3"/>
+            <wp:cNvGraphicFramePr>
+              <a:graphicFrameLocks noChangeAspect="1"/>
+            </wp:cNvGraphicFramePr>
+            <a:graphic>
+              <a:graphicData uri="http://schemas.openxmlformats.org/drawingml/2006/picture">
+                <pic:pic>
+                  <pic:nvPicPr>
+                    <pic:cNvPr id="0" name="pipeline_schematic_compact.png"/>
+                    <pic:cNvPicPr/>
+                  </pic:nvPicPr>
+                  <pic:blipFill>
+                    <a:blip r:embed="rId11"/>
+                    <a:stretch>
+                      <a:fillRect/>
+                    </a:stretch>
+                  </pic:blipFill>
+                  <pic:spPr>
+                    <a:xfrm>
+                      <a:off x="0" y="0"/>
+                      <a:ext cx="6400800" cy="7054285"/>
+                    </a:xfrm>
+                    <a:prstGeom prst="rect"/>
+                  </pic:spPr>
+                </pic:pic>
+              </a:graphicData>
+            </a:graphic>
+          </wp:inline>
+        </w:drawing>
+      </w:r>
+    </w:p>
+    <w:p>
+      <w:pPr>
+        <w:spacing w:after="120"/>
+      </w:pPr>
+      <w:r>
+        <w:rPr>
+          <w:sz w:val="18"/>
+        </w:rPr>
+      </w:r>
+      <w:r>
+        <w:rPr>
+          <w:b/>
+          <w:sz w:val="18"/>
+        </w:rPr>
+        <w:t>Figure 1. Modular Nextflow framework for ancestry-aware genotype harmonization and GWAS.</w:t>
+      </w:r>
+      <w:r>
+        <w:rPr>
+          <w:sz w:val="18"/>
+        </w:rPr>
+      </w:r>
+    </w:p>
+    <w:p>
+      <w:pPr>
+        <w:spacing w:after="120"/>
+      </w:pPr>
+      <w:r>
+        <w:rPr>
+          <w:sz w:val="18"/>
+        </w:rPr>
+      </w:r>
+      <w:r>
+        <w:rPr>
+          <w:b/>
+          <w:sz w:val="18"/>
+        </w:rPr>
+        <w:t>(A)</w:t>
+      </w:r>
+      <w:r>
+        <w:rPr>
+          <w:sz w:val="18"/>
+        </w:rPr>
+        <w:t xml:space="preserve"> Genotype harmonization, imputation, quality control (QC) and ancestry inference (Nextflow_Genotype_Pipeline). Heterogeneous array genotypes (multiple platforms, batches, file layouts and genome builds) are converted, lifted over to hg38, aligned to the reference and merged by platform using a UNION strategy that preserves variant diversity (Module 1). Each platform is imputed separately on the TOPMed, Michigan and/or All of Us (AnVIL) imputation servers through automated job submission and retrieval (Module 2), filtered with the ancestry-aware MagicalRsq-X quality metric rather than a fixed R² cut-off (Module 3), harmonized and INTERSECTION-merged across platforms (Module 4), optionally re-imputed to recover variants lost at the intersection (Module 5), and passed through final sample- and variant-level QC including Hardy–Weinberg, minor allele frequency, heterozygosity, sex-check, relatedness and principal-component analyses (Module 6). Global ancestry is inferred with GRAF-anc and ADMIXTURE, and local ancestry with RFMix v2, FLARE or G-NOMIX against a 1000 Genomes–HGDP reference panel (Module 7). An optional benchmarking module compares imputed genotypes with whole-genome-sequencing truth, contrasts six QC/merge strategies across three imputation servers, and simulates phenotypes with GCTA to quantify GWAS power, hit recovery and local-ancestry accuracy within each ancestry group (Module 8; inset panels are illustrative). The output is an analysis-ready genotype set with global ancestry calls and local ancestry tracts.</w:t>
+      </w:r>
+    </w:p>
+    <w:p>
+      <w:pPr>
+        <w:spacing w:after="120"/>
+      </w:pPr>
+      <w:r>
+        <w:rPr>
+          <w:sz w:val="18"/>
+        </w:rPr>
+      </w:r>
+      <w:r>
+        <w:rPr>
+          <w:b/>
+          <w:sz w:val="18"/>
+        </w:rPr>
+        <w:t>(B)</w:t>
+      </w:r>
+      <w:r>
+        <w:rPr>
+          <w:sz w:val="18"/>
+        </w:rPr>
+        <w:t xml:space="preserve"> Ancestry-aware GWAS and downstream analyses (Nextflow_GWAS_pipeline). Harmonized genotypes, phenotypes and ancestry calls from (A) are QC'd and stratified into major and admixed ancestry groups, and GWAS is run in parallel per group and trait with REGENIE, SAIGE, BOLT-LMM, PLINK2 or GENESIS mixed models; admixed groups are additionally analysed with Tractor, which decomposes effects by local ancestry (two-way for African American, three-way for Latino participants), and time-to-event outcomes with SPA-Cox. Group-level results are combined with MR-MEGA meta-regression, which models ancestry-correlated heterogeneity, then fine-mapped within ancestry (PolyFun + SuSiE) and across ancestries (MG-FLASH-FM, SuSiE-ME). Downstream subworkflows compute ancestry-aware polygenic risk scores (PRS-CSx, PRS-CS, GAUDI, LDpred2), heritability and cross-ancestry genetic correlation (LDSC, GCTA), colocalization with ancestry-matched QTL resources, and functional annotation (MAGMA, FUMA, LAVA, FLAMES), followed by visualization and automated reporting. Every module in both pipelines is an independent Nextflow DSL2 entry point, so the framework can be run end-to-end or any module can be run alone on existing outputs; dashed outlines mark optional modules and orange marks admixed-population methods. </w:t>
+      </w:r>
+      <w:r>
+        <w:rPr>
+          <w:b/>
+          <w:sz w:val="18"/>
+        </w:rPr>
+        <w:t>(C)</w:t>
+      </w:r>
+      <w:r>
+        <w:rPr>
+          <w:sz w:val="18"/>
+        </w:rPr>
+        <w:t xml:space="preserve"> Principal departures from a typical GWAS workflow: end-to-end containerized merging instead of cohort-specific scripts; two-step imputation against the diverse TOPMed and All of Us AnVIL panels rather than a single largely European panel; ancestry-aware MagicalRsq-X filtering instead of a fixed R² cut-off; GRAF-anc plus local ancestry inference instead of self-report or global principal components; benchmarking built into the workflow; and containerized, parallelized, portable execution on HPC/SLURM.</w:t>
+      </w:r>
+    </w:p>
+    <w:p>
+      <w:pPr>
+        <w:pStyle w:val="Heading2"/>
+      </w:pPr>
+      <w:r>
+        <w:t>Shorter caption (about 120 words)</w:t>
+      </w:r>
+    </w:p>
+    <w:p>
+      <w:pPr>
+        <w:spacing w:after="120"/>
+      </w:pPr>
+      <w:r>
+        <w:rPr>
+          <w:sz w:val="18"/>
+        </w:rPr>
+      </w:r>
       <w:r>
         <w:rPr>
           <w:b/>
@@ -115,21 +516,17 @@
     <w:p>
       <w:r>
         <w:rPr>
-          <w:b/>
-          <w:sz w:val="20"/>
+          <w:sz w:val="18"/>
         </w:rPr>
-        <w:t>Figure 1, full-detail version without Panel C (fits one portrait page)</w:t>
+        <w:t>Full-detail version, Panels A and B only.</w:t>
       </w:r>
     </w:p>
     <w:p>
-      <w:pPr>
-        <w:jc w:val="center"/>
-      </w:pPr>
       <w:r>
         <w:drawing>
           <wp:inline xmlns:a="http://schemas.openxmlformats.org/drawingml/2006/main" xmlns:pic="http://schemas.openxmlformats.org/drawingml/2006/picture">
-            <wp:extent cx="6400800" cy="7975866"/>
-            <wp:docPr id="2" name="Picture 2"/>
+            <wp:extent cx="6217920" cy="7747984"/>
+            <wp:docPr id="4" name="Picture 4"/>
             <wp:cNvGraphicFramePr>
               <a:graphicFrameLocks noChangeAspect="1"/>
             </wp:cNvGraphicFramePr>
@@ -141,7 +538,7 @@
                     <pic:cNvPicPr/>
                   </pic:nvPicPr>
                   <pic:blipFill>
-                    <a:blip r:embed="rId10"/>
+                    <a:blip r:embed="rId12"/>
                     <a:stretch>
                       <a:fillRect/>
                     </a:stretch>
@@ -149,7 +546,7 @@
                   <pic:spPr>
                     <a:xfrm>
                       <a:off x="0" y="0"/>
-                      <a:ext cx="6400800" cy="7975866"/>
+                      <a:ext cx="6217920" cy="7747984"/>
                     </a:xfrm>
                     <a:prstGeom prst="rect"/>
                   </pic:spPr>
@@ -160,228 +557,9 @@
         </w:drawing>
       </w:r>
     </w:p>
-    <w:p>
-      <w:pPr>
-        <w:spacing w:after="120"/>
-      </w:pPr>
-      <w:r>
-        <w:rPr>
-          <w:b/>
-          <w:sz w:val="18"/>
-        </w:rPr>
-        <w:t>Figure 1. Modular Nextflow framework for ancestry-aware genotype harmonization and GWAS.</w:t>
-      </w:r>
-      <w:r>
-        <w:rPr>
-          <w:sz w:val="18"/>
-        </w:rPr>
-        <w:t xml:space="preserve"> </w:t>
-      </w:r>
-      <w:r>
-        <w:rPr>
-          <w:b/>
-          <w:sz w:val="18"/>
-        </w:rPr>
-        <w:t>(A)</w:t>
-      </w:r>
-      <w:r>
-        <w:rPr>
-          <w:sz w:val="18"/>
-        </w:rPr>
-        <w:t xml:space="preserve"> Genotype harmonization, imputation, quality control (QC) and ancestry inference (</w:t>
-      </w:r>
-      <w:r>
-        <w:rPr>
-          <w:rFonts w:ascii="Consolas" w:hAnsi="Consolas"/>
-          <w:sz w:val="18"/>
-        </w:rPr>
-        <w:t>Nextflow_Genotype_Pipeline</w:t>
-      </w:r>
-      <w:r>
-        <w:rPr>
-          <w:sz w:val="18"/>
-        </w:rPr>
-        <w:t xml:space="preserve">). Heterogeneous array genotypes (multiple platforms, batches, file layouts and genome builds) are converted, lifted over to hg38, aligned to the reference and merged by platform using a UNION strategy that preserves variant diversity (Module 1). Each platform is imputed separately on the TOPMed, Michigan and/or All of Us (AnVIL) imputation servers through automated job submission and retrieval (Module 2), filtered with the ancestry-aware MagicalRsq-X quality metric rather than a fixed R² cut-off (Module 3), harmonized and INTERSECTION-merged across platforms (Module 4), optionally re-imputed to recover variants lost at the intersection (Module 5), and passed through final sample- and variant-level QC including Hardy–Weinberg, minor allele frequency, heterozygosity, sex-check, relatedness and principal-component analyses (Module 6). Global ancestry is inferred with GRAF-anc and ADMIXTURE, and local ancestry with RFMix v2, FLARE or G-NOMIX against a 1000 Genomes–HGDP reference panel (Module 7). An optional benchmarking module compares imputed genotypes with whole-genome-sequencing truth, contrasts six QC/merge strategies across three imputation servers, and simulates phenotypes with GCTA to quantify GWAS power, hit recovery and local-ancestry accuracy within each ancestry group (Module 8; inset panels are illustrative). The output is an analysis-ready genotype set with global ancestry calls and local ancestry tracts. </w:t>
-      </w:r>
-      <w:r>
-        <w:rPr>
-          <w:b/>
-          <w:sz w:val="18"/>
-        </w:rPr>
-        <w:t>(B)</w:t>
-      </w:r>
-      <w:r>
-        <w:rPr>
-          <w:sz w:val="18"/>
-        </w:rPr>
-        <w:t xml:space="preserve"> Ancestry-aware GWAS and downstream analyses (</w:t>
-      </w:r>
-      <w:r>
-        <w:rPr>
-          <w:rFonts w:ascii="Consolas" w:hAnsi="Consolas"/>
-          <w:sz w:val="18"/>
-        </w:rPr>
-        <w:t>Nextflow_GWAS_pipeline</w:t>
-      </w:r>
-      <w:r>
-        <w:rPr>
-          <w:sz w:val="18"/>
-        </w:rPr>
-        <w:t xml:space="preserve">). Harmonized genotypes, phenotypes and ancestry calls from (A) are QC'd and stratified into major and admixed ancestry groups, and GWAS is run in parallel per group and trait with REGENIE, SAIGE, BOLT-LMM, PLINK2 or GENESIS mixed models; admixed groups are additionally analysed with Tractor, which decomposes effects by local ancestry (two-way for African American, three-way for Latino participants), and time-to-event outcomes with SPA-Cox. Group-level results are combined with MR-MEGA meta-regression, which models ancestry-correlated heterogeneity, then fine-mapped within ancestry (PolyFun + SuSiE) and across ancestries (MG-FLASH-FM, SuSiE-ME). Downstream subworkflows compute ancestry-aware polygenic risk scores (PRS-CSx, PRS-CS, GAUDI, LDpred2), heritability and cross-ancestry genetic correlation (LDSC, GCTA), colocalization with ancestry-matched QTL resources, and functional annotation (MAGMA, FUMA, LAVA, FLAMES), followed by visualization and automated reporting. Every module in both pipelines is an independent Nextflow DSL2 entry point, so the framework can be run end-to-end or any module can be run alone on existing outputs; dashed outlines mark optional modules and orange marks admixed-population methods.  </w:t>
-      </w:r>
-      <w:r>
-        <w:rPr>
-          <w:b/>
-          <w:sz w:val="18"/>
-        </w:rPr>
-        <w:t>(C, if included)</w:t>
-      </w:r>
-      <w:r>
-        <w:rPr>
-          <w:sz w:val="18"/>
-        </w:rPr>
-        <w:t xml:space="preserve"> Principal departures from a typical GWAS workflow: end-to-end containerized merging instead of cohort-specific scripts; two-step imputation against the diverse TOPMed and All of Us AnVIL panels rather than a single largely European panel; ancestry-aware MagicalRsq-X filtering instead of a fixed R² cut-off; GRAF-anc plus local ancestry inference instead of self-report or global principal components; benchmarking built into the workflow; and containerized, parallelized, portable execution on HPC/SLURM.</w:t>
-      </w:r>
-    </w:p>
-    <w:p>
-      <w:r>
-        <w:br w:type="page"/>
-      </w:r>
-    </w:p>
-    <w:p>
-      <w:r>
-        <w:rPr>
-          <w:b/>
-          <w:sz w:val="20"/>
-        </w:rPr>
-        <w:t>Figure 1, full-detail version with Panel C (scaled to fit; best used as a full page)</w:t>
-      </w:r>
-    </w:p>
-    <w:p>
-      <w:pPr>
-        <w:jc w:val="center"/>
-      </w:pPr>
-      <w:r>
-        <w:drawing>
-          <wp:inline xmlns:a="http://schemas.openxmlformats.org/drawingml/2006/main" xmlns:pic="http://schemas.openxmlformats.org/drawingml/2006/picture">
-            <wp:extent cx="5852160" cy="8525463"/>
-            <wp:docPr id="3" name="Picture 3"/>
-            <wp:cNvGraphicFramePr>
-              <a:graphicFrameLocks noChangeAspect="1"/>
-            </wp:cNvGraphicFramePr>
-            <a:graphic>
-              <a:graphicData uri="http://schemas.openxmlformats.org/drawingml/2006/picture">
-                <pic:pic>
-                  <pic:nvPicPr>
-                    <pic:cNvPr id="0" name="pipeline_schematic.png"/>
-                    <pic:cNvPicPr/>
-                  </pic:nvPicPr>
-                  <pic:blipFill>
-                    <a:blip r:embed="rId11"/>
-                    <a:stretch>
-                      <a:fillRect/>
-                    </a:stretch>
-                  </pic:blipFill>
-                  <pic:spPr>
-                    <a:xfrm>
-                      <a:off x="0" y="0"/>
-                      <a:ext cx="5852160" cy="8525463"/>
-                    </a:xfrm>
-                    <a:prstGeom prst="rect"/>
-                  </pic:spPr>
-                </pic:pic>
-              </a:graphicData>
-            </a:graphic>
-          </wp:inline>
-        </w:drawing>
-      </w:r>
-    </w:p>
-    <w:p>
-      <w:pPr>
-        <w:spacing w:after="120"/>
-      </w:pPr>
-      <w:r>
-        <w:rPr>
-          <w:b/>
-          <w:sz w:val="18"/>
-        </w:rPr>
-        <w:t>Figure 1. Modular Nextflow framework for ancestry-aware genotype harmonization and GWAS.</w:t>
-      </w:r>
-      <w:r>
-        <w:rPr>
-          <w:sz w:val="18"/>
-        </w:rPr>
-        <w:t xml:space="preserve"> </w:t>
-      </w:r>
-      <w:r>
-        <w:rPr>
-          <w:b/>
-          <w:sz w:val="18"/>
-        </w:rPr>
-        <w:t>(A)</w:t>
-      </w:r>
-      <w:r>
-        <w:rPr>
-          <w:sz w:val="18"/>
-        </w:rPr>
-        <w:t xml:space="preserve"> Genotype harmonization, imputation, quality control (QC) and ancestry inference (</w:t>
-      </w:r>
-      <w:r>
-        <w:rPr>
-          <w:rFonts w:ascii="Consolas" w:hAnsi="Consolas"/>
-          <w:sz w:val="18"/>
-        </w:rPr>
-        <w:t>Nextflow_Genotype_Pipeline</w:t>
-      </w:r>
-      <w:r>
-        <w:rPr>
-          <w:sz w:val="18"/>
-        </w:rPr>
-        <w:t xml:space="preserve">). Heterogeneous array genotypes (multiple platforms, batches, file layouts and genome builds) are converted, lifted over to hg38, aligned to the reference and merged by platform using a UNION strategy that preserves variant diversity (Module 1). Each platform is imputed separately on the TOPMed, Michigan and/or All of Us (AnVIL) imputation servers through automated job submission and retrieval (Module 2), filtered with the ancestry-aware MagicalRsq-X quality metric rather than a fixed R² cut-off (Module 3), harmonized and INTERSECTION-merged across platforms (Module 4), optionally re-imputed to recover variants lost at the intersection (Module 5), and passed through final sample- and variant-level QC including Hardy–Weinberg, minor allele frequency, heterozygosity, sex-check, relatedness and principal-component analyses (Module 6). Global ancestry is inferred with GRAF-anc and ADMIXTURE, and local ancestry with RFMix v2, FLARE or G-NOMIX against a 1000 Genomes–HGDP reference panel (Module 7). An optional benchmarking module compares imputed genotypes with whole-genome-sequencing truth, contrasts six QC/merge strategies across three imputation servers, and simulates phenotypes with GCTA to quantify GWAS power, hit recovery and local-ancestry accuracy within each ancestry group (Module 8; inset panels are illustrative). The output is an analysis-ready genotype set with global ancestry calls and local ancestry tracts. </w:t>
-      </w:r>
-      <w:r>
-        <w:rPr>
-          <w:b/>
-          <w:sz w:val="18"/>
-        </w:rPr>
-        <w:t>(B)</w:t>
-      </w:r>
-      <w:r>
-        <w:rPr>
-          <w:sz w:val="18"/>
-        </w:rPr>
-        <w:t xml:space="preserve"> Ancestry-aware GWAS and downstream analyses (</w:t>
-      </w:r>
-      <w:r>
-        <w:rPr>
-          <w:rFonts w:ascii="Consolas" w:hAnsi="Consolas"/>
-          <w:sz w:val="18"/>
-        </w:rPr>
-        <w:t>Nextflow_GWAS_pipeline</w:t>
-      </w:r>
-      <w:r>
-        <w:rPr>
-          <w:sz w:val="18"/>
-        </w:rPr>
-        <w:t xml:space="preserve">). Harmonized genotypes, phenotypes and ancestry calls from (A) are QC'd and stratified into major and admixed ancestry groups, and GWAS is run in parallel per group and trait with REGENIE, SAIGE, BOLT-LMM, PLINK2 or GENESIS mixed models; admixed groups are additionally analysed with Tractor, which decomposes effects by local ancestry (two-way for African American, three-way for Latino participants), and time-to-event outcomes with SPA-Cox. Group-level results are combined with MR-MEGA meta-regression, which models ancestry-correlated heterogeneity, then fine-mapped within ancestry (PolyFun + SuSiE) and across ancestries (MG-FLASH-FM, SuSiE-ME). Downstream subworkflows compute ancestry-aware polygenic risk scores (PRS-CSx, PRS-CS, GAUDI, LDpred2), heritability and cross-ancestry genetic correlation (LDSC, GCTA), colocalization with ancestry-matched QTL resources, and functional annotation (MAGMA, FUMA, LAVA, FLAMES), followed by visualization and automated reporting. Every module in both pipelines is an independent Nextflow DSL2 entry point, so the framework can be run end-to-end or any module can be run alone on existing outputs; dashed outlines mark optional modules and orange marks admixed-population methods. </w:t>
-      </w:r>
-      <w:r>
-        <w:rPr>
-          <w:b/>
-          <w:sz w:val="18"/>
-        </w:rPr>
-        <w:t>(C)</w:t>
-      </w:r>
-      <w:r>
-        <w:rPr>
-          <w:sz w:val="18"/>
-        </w:rPr>
-        <w:t xml:space="preserve"> Principal departures from a typical GWAS workflow: end-to-end containerized merging instead of cohort-specific scripts; two-step imputation against the diverse TOPMed and All of Us AnVIL panels rather than a single largely European panel; ancestry-aware MagicalRsq-X filtering instead of a fixed R² cut-off; GRAF-anc plus local ancestry inference instead of self-report or global principal components; benchmarking built into the workflow; and containerized, parallelized, portable execution on HPC/SLURM.</w:t>
-      </w:r>
-    </w:p>
     <w:sectPr>
-      <w:pgSz w:w="12240" w:h="15840"/>
-      <w:pgMar w:top="720" w:right="720" w:bottom="720" w:left="720" w:header="720" w:footer="720" w:gutter="0"/>
+      <w:pgSz w:w="15840" w:h="12240"/>
+      <w:pgMar w:top="1080" w:right="1080" w:bottom="1080" w:left="1080" w:header="720" w:footer="720" w:gutter="0"/>
       <w:cols w:space="720"/>
       <w:docGrid w:linePitch="360"/>
     </w:sectPr>
@@ -752,9 +930,6 @@
     <w:name w:val="Normal"/>
     <w:qFormat/>
     <w:rsid w:val="00FC693F"/>
-    <w:rPr>
-      <w:rFonts w:ascii="Arial" w:hAnsi="Arial"/>
-    </w:rPr>
   </w:style>
   <w:style w:type="paragraph" w:styleId="Header">
     <w:name w:val="header"/>

</xml_diff>

<commit_message>
Simplify schematic: takeaways first, fewer labels, larger text
Panel A is now the typical-vs-framework table with a highlighted
"This framework" column; Panels B and C show each pipeline as five
phases with one line each. Removes module chips, group subsets and
caveat text, adds Tractor to the GWAS software list, and enlarges the
phase subtext.

Co-Authored-By: Claude Fable 5.1 <noreply@anthropic.com>
Claude-Session: https://claude.ai/code/session_018QsH3eLkvymJ4uH9sH99fS
</commit_message>
<xml_diff>
--- a/docs/figures/pipeline_schematic_figure.docx
+++ b/docs/figures/pipeline_schematic_figure.docx
@@ -15,14 +15,14 @@
         <w:rPr>
           <w:sz w:val="18"/>
         </w:rPr>
-        <w:t>Option 2 (portrait). Full-width at 7.5 in; body text about 6 pt.</w:t>
+        <w:t>Option 2 (portrait), 7 in wide.</w:t>
       </w:r>
     </w:p>
     <w:p>
       <w:r>
         <w:drawing>
           <wp:inline xmlns:a="http://schemas.openxmlformats.org/drawingml/2006/main" xmlns:pic="http://schemas.openxmlformats.org/drawingml/2006/picture">
-            <wp:extent cx="6400800" cy="6476202"/>
+            <wp:extent cx="6400800" cy="7012395"/>
             <wp:docPr id="1" name="Picture 1"/>
             <wp:cNvGraphicFramePr>
               <a:graphicFrameLocks noChangeAspect="1"/>
@@ -43,7 +43,7 @@
                   <pic:spPr>
                     <a:xfrm>
                       <a:off x="0" y="0"/>
-                      <a:ext cx="6400800" cy="6476202"/>
+                      <a:ext cx="6400800" cy="7012395"/>
                     </a:xfrm>
                     <a:prstGeom prst="rect"/>
                   </pic:spPr>
@@ -60,6 +60,7 @@
       </w:pPr>
       <w:r>
         <w:rPr>
+          <w:b w:val="0"/>
           <w:sz w:val="18"/>
         </w:rPr>
       </w:r>
@@ -72,6 +73,7 @@
       </w:r>
       <w:r>
         <w:rPr>
+          <w:b w:val="0"/>
           <w:sz w:val="18"/>
         </w:rPr>
       </w:r>
@@ -82,6 +84,7 @@
       </w:pPr>
       <w:r>
         <w:rPr>
+          <w:b w:val="0"/>
           <w:sz w:val="18"/>
         </w:rPr>
       </w:r>
@@ -94,9 +97,10 @@
       </w:r>
       <w:r>
         <w:rPr>
+          <w:b w:val="0"/>
           <w:sz w:val="18"/>
         </w:rPr>
-        <w:t xml:space="preserve"> Genotype harmonization, QC and ancestry inference (Nextflow_Genotype_Pipeline, modules M0–M8). Genotypes from multiple arrays, batches and genome builds are lifted over, aligned and UNION-merged, imputed on the TOPMed, Michigan and All of Us servers through automated job handling, filtered with the ancestry-aware MagicalRsq-X metric instead of a fixed R² cut-off, intersection-merged and optionally re-imputed, and passed through final QC. Global ancestry (GRAF-anc) and local ancestry tracts (RFMix) are inferred, and an optional benchmarking module compares imputed genotypes with whole-genome sequencing truth and simulates GWAS power by ancestry (insets illustrative).</w:t>
+        <w:t xml:space="preserve"> Key differences from a typical GWAS workflow, for genotype harmonization and for association and downstream analysis.</w:t>
       </w:r>
     </w:p>
     <w:p>
@@ -105,6 +109,7 @@
       </w:pPr>
       <w:r>
         <w:rPr>
+          <w:b w:val="0"/>
           <w:sz w:val="18"/>
         </w:rPr>
       </w:r>
@@ -117,9 +122,10 @@
       </w:r>
       <w:r>
         <w:rPr>
+          <w:b w:val="0"/>
           <w:sz w:val="18"/>
         </w:rPr>
-        <w:t xml:space="preserve"> Ancestry-aware GWAS and downstream analyses (Nextflow_GWAS_pipeline). Harmonized genotypes and ancestry calls are stratified into continental and admixed groups and analysed in parallel per ancestry and trait (REGENIE, SAIGE, GENESIS), with Tractor decomposing effects by local ancestry in African American and Latin American participants and time-to-event GWAS that incorporates local ancestry (GENESIS extension). Group results are combined by MR-MEGA / MR-MEGA-env meta-regression, which models ancestry-aware and cohort-specific heterogeneity, fine-mapped within ancestry (PolyFun + SuSiE) and across traits and ancestries (MG-FLASH-FM for related traits), and carried into ancestry-aware polygenic scores, heritability, colocalization with diverse QTL resources and functional annotation.</w:t>
+        <w:t xml:space="preserve"> Genotype harmonization, QC and ancestry inference (Nextflow_Genotype_Pipeline). Genotypes from multiple arrays, batches and genome builds are lifted over, aligned and union-merged, imputed on the TOPMed, Michigan and All of Us servers through automated job handling, filtered with the ancestry-aware MagicalRsq-X metric instead of a fixed R² cut-off, merged and passed through final QC. Global ancestry (GRAF-anc) and local ancestry tracts (RFMix) are inferred, and an optional benchmarking module compares imputed genotypes with whole-genome sequencing truth and simulates GWAS power by ancestry (insets illustrative).</w:t>
       </w:r>
     </w:p>
     <w:p>
@@ -128,6 +134,7 @@
       </w:pPr>
       <w:r>
         <w:rPr>
+          <w:b w:val="0"/>
           <w:sz w:val="18"/>
         </w:rPr>
       </w:r>
@@ -140,14 +147,10 @@
       </w:r>
       <w:r>
         <w:rPr>
+          <w:b w:val="0"/>
           <w:sz w:val="18"/>
         </w:rPr>
-        <w:t xml:space="preserve"> Key differences from a typical GWAS workflow. Every module is an independent Nextflow entry point, so the framework runs end to end or module by module; dashed outlines mark optional modules and orange marks admixed-population methods.</w:t>
-      </w:r>
-    </w:p>
-    <w:p>
-      <w:r>
-        <w:br w:type="page"/>
+        <w:t xml:space="preserve"> Ancestry-aware GWAS and downstream analyses (Nextflow_GWAS_pipeline). Harmonized genotypes are stratified into GRAF-anc ancestry groups, which resolve finer than continental labels and include Amerindigenous and admixed groups, and analysed in parallel per ancestry and trait with REGENIE, SAIGE, GENESIS or Tractor, including time-to-event GWAS that incorporates local ancestry. Group results are combined by MR-MEGA-env meta-regression, which models ancestry-related and cohort-specific heterogeneity, fine-mapped within ancestry (PolyFun + SuSiE) and across traits and ancestries (MG-FLASH-FM for related traits), and carried into ancestry-aware polygenic scores, heritability, colocalization and functional annotation. Every step is an independent Nextflow entry point, so the framework runs end to end or step by step; dashed outlines mark optional steps.</w:t>
       </w:r>
     </w:p>
     <w:p>
@@ -165,14 +168,14 @@
         <w:rPr>
           <w:sz w:val="18"/>
         </w:rPr>
-        <w:t>Option 1 (landscape). Full-width at 9.5 in.</w:t>
+        <w:t>Option 1 (landscape), 9.5 in wide.</w:t>
       </w:r>
     </w:p>
     <w:p>
       <w:r>
         <w:drawing>
           <wp:inline xmlns:a="http://schemas.openxmlformats.org/drawingml/2006/main" xmlns:pic="http://schemas.openxmlformats.org/drawingml/2006/picture">
-            <wp:extent cx="8686800" cy="5077435"/>
+            <wp:extent cx="8686800" cy="4412894"/>
             <wp:docPr id="2" name="Picture 2"/>
             <wp:cNvGraphicFramePr>
               <a:graphicFrameLocks noChangeAspect="1"/>
@@ -193,7 +196,7 @@
                   <pic:spPr>
                     <a:xfrm>
                       <a:off x="0" y="0"/>
-                      <a:ext cx="8686800" cy="5077435"/>
+                      <a:ext cx="8686800" cy="4412894"/>
                     </a:xfrm>
                     <a:prstGeom prst="rect"/>
                   </pic:spPr>
@@ -210,6 +213,7 @@
       </w:pPr>
       <w:r>
         <w:rPr>
+          <w:b w:val="0"/>
           <w:sz w:val="18"/>
         </w:rPr>
       </w:r>
@@ -222,6 +226,7 @@
       </w:r>
       <w:r>
         <w:rPr>
+          <w:b w:val="0"/>
           <w:sz w:val="18"/>
         </w:rPr>
       </w:r>
@@ -232,6 +237,7 @@
       </w:pPr>
       <w:r>
         <w:rPr>
+          <w:b w:val="0"/>
           <w:sz w:val="18"/>
         </w:rPr>
       </w:r>
@@ -244,9 +250,10 @@
       </w:r>
       <w:r>
         <w:rPr>
+          <w:b w:val="0"/>
           <w:sz w:val="18"/>
         </w:rPr>
-        <w:t xml:space="preserve"> Genotype harmonization, QC and ancestry inference (Nextflow_Genotype_Pipeline, modules M0–M8). Genotypes from multiple arrays, batches and genome builds are lifted over, aligned and UNION-merged, imputed on the TOPMed, Michigan and All of Us servers through automated job handling, filtered with the ancestry-aware MagicalRsq-X metric instead of a fixed R² cut-off, intersection-merged and optionally re-imputed, and passed through final QC. Global ancestry (GRAF-anc) and local ancestry tracts (RFMix) are inferred, and an optional benchmarking module compares imputed genotypes with whole-genome sequencing truth and simulates GWAS power by ancestry (insets illustrative).</w:t>
+        <w:t xml:space="preserve"> Key differences from a typical GWAS workflow, for genotype harmonization and for association and downstream analysis.</w:t>
       </w:r>
     </w:p>
     <w:p>
@@ -255,6 +262,7 @@
       </w:pPr>
       <w:r>
         <w:rPr>
+          <w:b w:val="0"/>
           <w:sz w:val="18"/>
         </w:rPr>
       </w:r>
@@ -267,9 +275,10 @@
       </w:r>
       <w:r>
         <w:rPr>
+          <w:b w:val="0"/>
           <w:sz w:val="18"/>
         </w:rPr>
-        <w:t xml:space="preserve"> Ancestry-aware GWAS and downstream analyses (Nextflow_GWAS_pipeline). Harmonized genotypes and ancestry calls are stratified into continental and admixed groups and analysed in parallel per ancestry and trait (REGENIE, SAIGE, GENESIS), with Tractor decomposing effects by local ancestry in African American and Latin American participants and time-to-event GWAS that incorporates local ancestry (GENESIS extension). Group results are combined by MR-MEGA / MR-MEGA-env meta-regression, which models ancestry-aware and cohort-specific heterogeneity, fine-mapped within ancestry (PolyFun + SuSiE) and across traits and ancestries (MG-FLASH-FM for related traits), and carried into ancestry-aware polygenic scores, heritability, colocalization with diverse QTL resources and functional annotation.</w:t>
+        <w:t xml:space="preserve"> Genotype harmonization, QC and ancestry inference (Nextflow_Genotype_Pipeline). Genotypes from multiple arrays, batches and genome builds are lifted over, aligned and union-merged, imputed on the TOPMed, Michigan and All of Us servers through automated job handling, filtered with the ancestry-aware MagicalRsq-X metric instead of a fixed R² cut-off, merged and passed through final QC. Global ancestry (GRAF-anc) and local ancestry tracts (RFMix) are inferred, and an optional benchmarking module compares imputed genotypes with whole-genome sequencing truth and simulates GWAS power by ancestry (insets illustrative).</w:t>
       </w:r>
     </w:p>
     <w:p>
@@ -278,6 +287,7 @@
       </w:pPr>
       <w:r>
         <w:rPr>
+          <w:b w:val="0"/>
           <w:sz w:val="18"/>
         </w:rPr>
       </w:r>
@@ -290,9 +300,10 @@
       </w:r>
       <w:r>
         <w:rPr>
+          <w:b w:val="0"/>
           <w:sz w:val="18"/>
         </w:rPr>
-        <w:t xml:space="preserve"> Key differences from a typical GWAS workflow. Every module is an independent Nextflow entry point, so the framework runs end to end or module by module; dashed outlines mark optional modules and orange marks admixed-population methods.</w:t>
+        <w:t xml:space="preserve"> Ancestry-aware GWAS and downstream analyses (Nextflow_GWAS_pipeline). Harmonized genotypes are stratified into GRAF-anc ancestry groups, which resolve finer than continental labels and include Amerindigenous and admixed groups, and analysed in parallel per ancestry and trait with REGENIE, SAIGE, GENESIS or Tractor, including time-to-event GWAS that incorporates local ancestry. Group results are combined by MR-MEGA-env meta-regression, which models ancestry-related and cohort-specific heterogeneity, fine-mapped within ancestry (PolyFun + SuSiE) and across traits and ancestries (MG-FLASH-FM for related traits), and carried into ancestry-aware polygenic scores, heritability, colocalization and functional annotation. Every step is an independent Nextflow entry point, so the framework runs end to end or step by step; dashed outlines mark optional steps.</w:t>
       </w:r>
     </w:p>
     <w:p>
@@ -311,14 +322,6 @@
       </w:pPr>
       <w:r>
         <w:t>Detailed versions (documentation / talks)</w:t>
-      </w:r>
-    </w:p>
-    <w:p>
-      <w:r>
-        <w:rPr>
-          <w:sz w:val="18"/>
-        </w:rPr>
-        <w:t>Compact detailed version (one line per module).</w:t>
       </w:r>
     </w:p>
     <w:p>
@@ -363,6 +366,7 @@
       </w:pPr>
       <w:r>
         <w:rPr>
+          <w:b w:val="0"/>
           <w:sz w:val="18"/>
         </w:rPr>
       </w:r>
@@ -375,6 +379,7 @@
       </w:r>
       <w:r>
         <w:rPr>
+          <w:b w:val="0"/>
           <w:sz w:val="18"/>
         </w:rPr>
       </w:r>
@@ -385,6 +390,7 @@
       </w:pPr>
       <w:r>
         <w:rPr>
+          <w:b w:val="0"/>
           <w:sz w:val="18"/>
         </w:rPr>
       </w:r>
@@ -397,6 +403,7 @@
       </w:r>
       <w:r>
         <w:rPr>
+          <w:b w:val="0"/>
           <w:sz w:val="18"/>
         </w:rPr>
         <w:t xml:space="preserve"> Genotype harmonization, imputation, quality control (QC) and ancestry inference (Nextflow_Genotype_Pipeline). Heterogeneous array genotypes (multiple platforms, batches, file layouts and genome builds) are converted, lifted over to hg38, aligned to the reference and merged by platform using a UNION strategy that preserves variant diversity (Module 1). Each platform is imputed separately on the TOPMed, Michigan and/or All of Us (AnVIL) imputation servers through automated job submission and retrieval (Module 2), filtered with the ancestry-aware MagicalRsq-X quality metric rather than a fixed R² cut-off (Module 3), harmonized and INTERSECTION-merged across platforms (Module 4), optionally re-imputed to recover variants lost at the intersection (Module 5), and passed through final sample- and variant-level QC including Hardy–Weinberg, minor allele frequency, heterozygosity, sex-check, relatedness and principal-component analyses (Module 6). Global ancestry is inferred with GRAF-anc and ADMIXTURE, and local ancestry with RFMix v2, FLARE or G-NOMIX against a 1000 Genomes–HGDP reference panel (Module 7). An optional benchmarking module compares imputed genotypes with whole-genome-sequencing truth, contrasts six QC/merge strategies across three imputation servers, and simulates phenotypes with GCTA to quantify GWAS power, hit recovery and local-ancestry accuracy within each ancestry group (Module 8; inset panels are illustrative). The output is an analysis-ready genotype set with global ancestry calls and local ancestry tracts.</w:t>
@@ -408,6 +415,7 @@
       </w:pPr>
       <w:r>
         <w:rPr>
+          <w:b w:val="0"/>
           <w:sz w:val="18"/>
         </w:rPr>
       </w:r>
@@ -420,6 +428,7 @@
       </w:r>
       <w:r>
         <w:rPr>
+          <w:b w:val="0"/>
           <w:sz w:val="18"/>
         </w:rPr>
         <w:t xml:space="preserve"> Ancestry-aware GWAS and downstream analyses (Nextflow_GWAS_pipeline). Harmonized genotypes, phenotypes and ancestry calls from (A) are QC'd and stratified into major and admixed ancestry groups, and GWAS is run in parallel per group and trait with REGENIE, SAIGE, BOLT-LMM, PLINK2 or GENESIS mixed models; admixed groups are additionally analysed with Tractor, which decomposes effects by local ancestry (two-way for African American, three-way for Latino participants), and time-to-event outcomes with SPA-Cox. Group-level results are combined with MR-MEGA meta-regression, which models ancestry-correlated heterogeneity, then fine-mapped within ancestry (PolyFun + SuSiE) and across ancestries (MG-FLASH-FM, SuSiE-ME). Downstream subworkflows compute ancestry-aware polygenic risk scores (PRS-CSx, PRS-CS, GAUDI, LDpred2), heritability and cross-ancestry genetic correlation (LDSC, GCTA), colocalization with ancestry-matched QTL resources, and functional annotation (MAGMA, FUMA, LAVA, FLAMES), followed by visualization and automated reporting. Every module in both pipelines is an independent Nextflow DSL2 entry point, so the framework can be run end-to-end or any module can be run alone on existing outputs; dashed outlines mark optional modules and orange marks admixed-population methods. </w:t>
@@ -433,128 +442,10 @@
       </w:r>
       <w:r>
         <w:rPr>
+          <w:b w:val="0"/>
           <w:sz w:val="18"/>
         </w:rPr>
         <w:t xml:space="preserve"> Principal departures from a typical GWAS workflow: end-to-end containerized merging instead of cohort-specific scripts; two-step imputation against the diverse TOPMed and All of Us AnVIL panels rather than a single largely European panel; ancestry-aware MagicalRsq-X filtering instead of a fixed R² cut-off; GRAF-anc plus local ancestry inference instead of self-report or global principal components; benchmarking built into the workflow; and containerized, parallelized, portable execution on HPC/SLURM.</w:t>
-      </w:r>
-    </w:p>
-    <w:p>
-      <w:pPr>
-        <w:pStyle w:val="Heading2"/>
-      </w:pPr>
-      <w:r>
-        <w:t>Shorter caption (about 120 words)</w:t>
-      </w:r>
-    </w:p>
-    <w:p>
-      <w:pPr>
-        <w:spacing w:after="120"/>
-      </w:pPr>
-      <w:r>
-        <w:rPr>
-          <w:sz w:val="18"/>
-        </w:rPr>
-      </w:r>
-      <w:r>
-        <w:rPr>
-          <w:b/>
-          <w:sz w:val="18"/>
-        </w:rPr>
-        <w:t>Figure 1. Modular Nextflow framework for ancestry-aware genotype harmonization and GWAS.</w:t>
-      </w:r>
-      <w:r>
-        <w:rPr>
-          <w:sz w:val="18"/>
-        </w:rPr>
-        <w:t xml:space="preserve"> </w:t>
-      </w:r>
-      <w:r>
-        <w:rPr>
-          <w:b/>
-          <w:sz w:val="18"/>
-        </w:rPr>
-        <w:t>(A)</w:t>
-      </w:r>
-      <w:r>
-        <w:rPr>
-          <w:sz w:val="18"/>
-        </w:rPr>
-        <w:t xml:space="preserve"> Array genotypes from multiple platforms and builds are harmonized, imputed on TOPMed, Michigan and/or All of Us servers, filtered with the ancestry-aware MagicalRsq-X metric, merged, QC'd and assigned global (GRAF-anc, ADMIXTURE) and local (RFMix, FLARE, G-NOMIX) ancestry. An optional module benchmarks imputation against WGS truth and simulates GWAS power by ancestry (insets illustrative). </w:t>
-      </w:r>
-      <w:r>
-        <w:rPr>
-          <w:b/>
-          <w:sz w:val="18"/>
-        </w:rPr>
-        <w:t>(B)</w:t>
-      </w:r>
-      <w:r>
-        <w:rPr>
-          <w:sz w:val="18"/>
-        </w:rPr>
-        <w:t xml:space="preserve"> Harmonized genotypes and ancestry calls feed ancestry-stratified GWAS (REGENIE, SAIGE, GENESIS; Tractor for admixed groups; SPA-Cox for survival), MR-MEGA meta-analysis, within- and multi-ancestry fine-mapping, and downstream PRS, heritability, colocalization and functional annotation with reporting. </w:t>
-      </w:r>
-      <w:r>
-        <w:rPr>
-          <w:b/>
-          <w:sz w:val="18"/>
-        </w:rPr>
-        <w:t>(C)</w:t>
-      </w:r>
-      <w:r>
-        <w:rPr>
-          <w:sz w:val="18"/>
-        </w:rPr>
-        <w:t xml:space="preserve"> Departures from a typical GWAS workflow: containerized end-to-end merging, two-step imputation on diverse panels, ancestry-aware variant filtering, GRAF-anc plus local ancestry, built-in benchmarking and portable execution. Modules run end-to-end or individually; dashed outlines are optional.</w:t>
-      </w:r>
-    </w:p>
-    <w:p>
-      <w:r>
-        <w:br w:type="page"/>
-      </w:r>
-    </w:p>
-    <w:p>
-      <w:r>
-        <w:rPr>
-          <w:sz w:val="18"/>
-        </w:rPr>
-        <w:t>Full-detail version, Panels A and B only.</w:t>
-      </w:r>
-    </w:p>
-    <w:p>
-      <w:r>
-        <w:drawing>
-          <wp:inline xmlns:a="http://schemas.openxmlformats.org/drawingml/2006/main" xmlns:pic="http://schemas.openxmlformats.org/drawingml/2006/picture">
-            <wp:extent cx="6217920" cy="7747984"/>
-            <wp:docPr id="4" name="Picture 4"/>
-            <wp:cNvGraphicFramePr>
-              <a:graphicFrameLocks noChangeAspect="1"/>
-            </wp:cNvGraphicFramePr>
-            <a:graphic>
-              <a:graphicData uri="http://schemas.openxmlformats.org/drawingml/2006/picture">
-                <pic:pic>
-                  <pic:nvPicPr>
-                    <pic:cNvPr id="0" name="pipeline_schematic_AB_only.png"/>
-                    <pic:cNvPicPr/>
-                  </pic:nvPicPr>
-                  <pic:blipFill>
-                    <a:blip r:embed="rId12"/>
-                    <a:stretch>
-                      <a:fillRect/>
-                    </a:stretch>
-                  </pic:blipFill>
-                  <pic:spPr>
-                    <a:xfrm>
-                      <a:off x="0" y="0"/>
-                      <a:ext cx="6217920" cy="7747984"/>
-                    </a:xfrm>
-                    <a:prstGeom prst="rect"/>
-                  </pic:spPr>
-                </pic:pic>
-              </a:graphicData>
-            </a:graphic>
-          </wp:inline>
-        </w:drawing>
       </w:r>
     </w:p>
     <w:sectPr>

</xml_diff>

<commit_message>
Add cancer-application schematic variant (benchmark + REDIAL streams)
Landscape layout whose harmonization lane starts from two data streams
(1000 Genomes arrays with matched WGS plus simulations; the REDIAL
pediatric ALL cohort on GSA v1/v2 with overlapping germline WGS) and
whose GWAS lane ends in cohort-specific outputs. Adds a "Cancer cohorts"
takeaway row and a matching caption.

Co-Authored-By: Claude Fable 5.1 <noreply@anthropic.com>
Claude-Session: https://claude.ai/code/session_018QsH3eLkvymJ4uH9sH99fS
</commit_message>
<xml_diff>
--- a/docs/figures/pipeline_schematic_figure.docx
+++ b/docs/figures/pipeline_schematic_figure.docx
@@ -7,22 +7,14 @@
         <w:pStyle w:val="Heading1"/>
       </w:pPr>
       <w:r>
-        <w:t>Pipeline schematic: key-takeaways options</w:t>
-      </w:r>
-    </w:p>
-    <w:p>
-      <w:r>
-        <w:rPr>
-          <w:sz w:val="18"/>
-        </w:rPr>
-        <w:t>Option 2 (portrait), 7 in wide.</w:t>
+        <w:t>Option 3: cancer application (benchmark + REDIAL streams)</w:t>
       </w:r>
     </w:p>
     <w:p>
       <w:r>
         <w:drawing>
           <wp:inline xmlns:a="http://schemas.openxmlformats.org/drawingml/2006/main" xmlns:pic="http://schemas.openxmlformats.org/drawingml/2006/picture">
-            <wp:extent cx="6400800" cy="7012395"/>
+            <wp:extent cx="8686800" cy="4864608"/>
             <wp:docPr id="1" name="Picture 1"/>
             <wp:cNvGraphicFramePr>
               <a:graphicFrameLocks noChangeAspect="1"/>
@@ -31,7 +23,7 @@
               <a:graphicData uri="http://schemas.openxmlformats.org/drawingml/2006/picture">
                 <pic:pic>
                   <pic:nvPicPr>
-                    <pic:cNvPr id="0" name="pipeline_schematic_stack.png"/>
+                    <pic:cNvPr id="0" name="pipeline_schematic_cancer.png"/>
                     <pic:cNvPicPr/>
                   </pic:nvPicPr>
                   <pic:blipFill>
@@ -43,7 +35,7 @@
                   <pic:spPr>
                     <a:xfrm>
                       <a:off x="0" y="0"/>
-                      <a:ext cx="6400800" cy="7012395"/>
+                      <a:ext cx="8686800" cy="4864608"/>
                     </a:xfrm>
                     <a:prstGeom prst="rect"/>
                   </pic:spPr>
@@ -69,106 +61,27 @@
           <w:b/>
           <w:sz w:val="18"/>
         </w:rPr>
-        <w:t>Figure 1. A modular, ancestry-aware framework for genotype harmonization and GWAS.</w:t>
+        <w:t>Figure 1. A modular, ancestry-aware framework for germline genotype harmonization and GWAS, benchmarked on public and simulated data and applied to the REDIAL pediatric leukemia cohort.</w:t>
       </w:r>
       <w:r>
         <w:rPr>
           <w:b w:val="0"/>
           <w:sz w:val="18"/>
         </w:rPr>
+        <w:t xml:space="preserve"> (A) Key differences between a typical GWAS workflow and this framework, for genotype harmonization and for association and downstream analysis. (B) Genotype harmonization, quality control and ancestry inference. Two data streams enter the same pipeline: a benchmarking stream of 1000 Genomes samples genotyped on multiple SNP arrays with matched whole-genome sequencing (WGS) truth plus simulated phenotypes, and the REDIAL (Reducing Ethnic Disparities in Acute Leukemias) cohort of children with acute lymphoblastic leukemia (ALL) from eight sites in Texas and California, genotyped on Illumina GSA v1/v2 arrays with overlapping germline WGS. Genotypes are lifted over, aligned and union-merged, imputed on the TOPMed, Michigan and All of Us servers, filtered with the ancestry-aware MagicalRsq-X metric, merged and passed through final QC, then assigned global (GRAF-anc) and local (RFMix) ancestry. The benchmarking stream, and the WGS-array overlap within REDIAL, allow imputation accuracy and simulated GWAS power to be quantified within each ancestry group before the pipeline is applied to cancer outcomes (insets illustrative). (C) Ancestry-aware GWAS and downstream analysis. Harmonized genotypes are stratified into GRAF-anc ancestry groups and analysed per ancestry and trait with REGENIE, SAIGE, GENESIS or Tractor, including time-to-event GWAS that incorporates local ancestry; results are combined by MR-MEGA-env meta-regression, fine-mapped within and across ancestries and traits (PolyFun + SuSiE, MG-FLASH-FM), and carried into ancestry-aware polygenic scores, heritability, colocalization and annotation. For REDIAL this yields ancestry-resolved germline associations with ALL risk and outcomes across a cohort in which genetic ancestry, self-reported race and ethnicity and clinical factors are known to interact (Kore et al., Cancer Epidemiol Biomarkers Prev 2026;35:710-717); the benchmarking stream yields accuracy and power estimates by ancestry. Every step is an independent, containerized Nextflow entry point; dashed outlines mark optional steps.</w:t>
+      </w:r>
+    </w:p>
+    <w:p>
+      <w:r>
+        <w:br w:type="page"/>
       </w:r>
     </w:p>
     <w:p>
       <w:pPr>
-        <w:spacing w:after="120"/>
+        <w:pStyle w:val="Heading1"/>
       </w:pPr>
       <w:r>
-        <w:rPr>
-          <w:b w:val="0"/>
-          <w:sz w:val="18"/>
-        </w:rPr>
-      </w:r>
-      <w:r>
-        <w:rPr>
-          <w:b/>
-          <w:sz w:val="18"/>
-        </w:rPr>
-        <w:t>(A)</w:t>
-      </w:r>
-      <w:r>
-        <w:rPr>
-          <w:b w:val="0"/>
-          <w:sz w:val="18"/>
-        </w:rPr>
-        <w:t xml:space="preserve"> Key differences from a typical GWAS workflow, for genotype harmonization and for association and downstream analysis.</w:t>
-      </w:r>
-    </w:p>
-    <w:p>
-      <w:pPr>
-        <w:spacing w:after="120"/>
-      </w:pPr>
-      <w:r>
-        <w:rPr>
-          <w:b w:val="0"/>
-          <w:sz w:val="18"/>
-        </w:rPr>
-      </w:r>
-      <w:r>
-        <w:rPr>
-          <w:b/>
-          <w:sz w:val="18"/>
-        </w:rPr>
-        <w:t>(B)</w:t>
-      </w:r>
-      <w:r>
-        <w:rPr>
-          <w:b w:val="0"/>
-          <w:sz w:val="18"/>
-        </w:rPr>
-        <w:t xml:space="preserve"> Genotype harmonization, QC and ancestry inference (Nextflow_Genotype_Pipeline). Genotypes from multiple arrays, batches and genome builds are lifted over, aligned and union-merged, imputed on the TOPMed, Michigan and All of Us servers through automated job handling, filtered with the ancestry-aware MagicalRsq-X metric instead of a fixed R² cut-off, merged and passed through final QC. Global ancestry (GRAF-anc) and local ancestry tracts (RFMix) are inferred, and an optional benchmarking module compares imputed genotypes with whole-genome sequencing truth and simulates GWAS power by ancestry (insets illustrative).</w:t>
-      </w:r>
-    </w:p>
-    <w:p>
-      <w:pPr>
-        <w:spacing w:after="120"/>
-      </w:pPr>
-      <w:r>
-        <w:rPr>
-          <w:b w:val="0"/>
-          <w:sz w:val="18"/>
-        </w:rPr>
-      </w:r>
-      <w:r>
-        <w:rPr>
-          <w:b/>
-          <w:sz w:val="18"/>
-        </w:rPr>
-        <w:t>(C)</w:t>
-      </w:r>
-      <w:r>
-        <w:rPr>
-          <w:b w:val="0"/>
-          <w:sz w:val="18"/>
-        </w:rPr>
-        <w:t xml:space="preserve"> Ancestry-aware GWAS and downstream analyses (Nextflow_GWAS_pipeline). Harmonized genotypes are stratified into GRAF-anc ancestry groups, which resolve finer than continental labels and include Amerindigenous and admixed groups, and analysed in parallel per ancestry and trait with REGENIE, SAIGE, GENESIS or Tractor, including time-to-event GWAS that incorporates local ancestry. Group results are combined by MR-MEGA-env meta-regression, which models ancestry-related and cohort-specific heterogeneity, fine-mapped within ancestry (PolyFun + SuSiE) and across traits and ancestries (MG-FLASH-FM for related traits), and carried into ancestry-aware polygenic scores, heritability, colocalization and functional annotation. Every step is an independent Nextflow entry point, so the framework runs end to end or step by step; dashed outlines mark optional steps.</w:t>
-      </w:r>
-    </w:p>
-    <w:p>
-      <w:pPr>
-        <w:sectPr>
-          <w:pgSz w:w="12240" w:h="15840"/>
-          <w:pgMar w:top="1080" w:right="1080" w:bottom="1080" w:left="1080" w:header="720" w:footer="720" w:gutter="0"/>
-          <w:cols w:space="720"/>
-          <w:docGrid w:linePitch="360"/>
-        </w:sectPr>
-      </w:pPr>
-    </w:p>
-    <w:p>
-      <w:r>
-        <w:rPr>
-          <w:sz w:val="18"/>
-        </w:rPr>
-        <w:t>Option 1 (landscape), 9.5 in wide.</w:t>
+        <w:t>Option 1: landscape</w:t>
       </w:r>
     </w:p>
     <w:p>
@@ -307,28 +220,23 @@
       </w:r>
     </w:p>
     <w:p>
-      <w:pPr>
-        <w:sectPr>
-          <w:pgSz w:w="15840" w:h="12240" w:orient="landscape"/>
-          <w:pgMar w:top="1080" w:right="1080" w:bottom="1080" w:left="1080" w:header="720" w:footer="720" w:gutter="0"/>
-          <w:cols w:space="720"/>
-          <w:docGrid w:linePitch="360"/>
-        </w:sectPr>
-      </w:pPr>
+      <w:r>
+        <w:br w:type="page"/>
+      </w:r>
     </w:p>
     <w:p>
       <w:pPr>
         <w:pStyle w:val="Heading1"/>
       </w:pPr>
       <w:r>
-        <w:t>Detailed versions (documentation / talks)</w:t>
+        <w:t>Option 2: portrait</w:t>
       </w:r>
     </w:p>
     <w:p>
       <w:r>
         <w:drawing>
           <wp:inline xmlns:a="http://schemas.openxmlformats.org/drawingml/2006/main" xmlns:pic="http://schemas.openxmlformats.org/drawingml/2006/picture">
-            <wp:extent cx="6400800" cy="7054285"/>
+            <wp:extent cx="5852160" cy="6411332"/>
             <wp:docPr id="3" name="Picture 3"/>
             <wp:cNvGraphicFramePr>
               <a:graphicFrameLocks noChangeAspect="1"/>
@@ -337,7 +245,7 @@
               <a:graphicData uri="http://schemas.openxmlformats.org/drawingml/2006/picture">
                 <pic:pic>
                   <pic:nvPicPr>
-                    <pic:cNvPr id="0" name="pipeline_schematic_compact.png"/>
+                    <pic:cNvPr id="0" name="pipeline_schematic_stack.png"/>
                     <pic:cNvPicPr/>
                   </pic:nvPicPr>
                   <pic:blipFill>
@@ -349,7 +257,7 @@
                   <pic:spPr>
                     <a:xfrm>
                       <a:off x="0" y="0"/>
-                      <a:ext cx="6400800" cy="7054285"/>
+                      <a:ext cx="5852160" cy="6411332"/>
                     </a:xfrm>
                     <a:prstGeom prst="rect"/>
                   </pic:spPr>
@@ -360,96 +268,8 @@
         </w:drawing>
       </w:r>
     </w:p>
-    <w:p>
-      <w:pPr>
-        <w:spacing w:after="120"/>
-      </w:pPr>
-      <w:r>
-        <w:rPr>
-          <w:b w:val="0"/>
-          <w:sz w:val="18"/>
-        </w:rPr>
-      </w:r>
-      <w:r>
-        <w:rPr>
-          <w:b/>
-          <w:sz w:val="18"/>
-        </w:rPr>
-        <w:t>Figure 1. Modular Nextflow framework for ancestry-aware genotype harmonization and GWAS.</w:t>
-      </w:r>
-      <w:r>
-        <w:rPr>
-          <w:b w:val="0"/>
-          <w:sz w:val="18"/>
-        </w:rPr>
-      </w:r>
-    </w:p>
-    <w:p>
-      <w:pPr>
-        <w:spacing w:after="120"/>
-      </w:pPr>
-      <w:r>
-        <w:rPr>
-          <w:b w:val="0"/>
-          <w:sz w:val="18"/>
-        </w:rPr>
-      </w:r>
-      <w:r>
-        <w:rPr>
-          <w:b/>
-          <w:sz w:val="18"/>
-        </w:rPr>
-        <w:t>(A)</w:t>
-      </w:r>
-      <w:r>
-        <w:rPr>
-          <w:b w:val="0"/>
-          <w:sz w:val="18"/>
-        </w:rPr>
-        <w:t xml:space="preserve"> Genotype harmonization, imputation, quality control (QC) and ancestry inference (Nextflow_Genotype_Pipeline). Heterogeneous array genotypes (multiple platforms, batches, file layouts and genome builds) are converted, lifted over to hg38, aligned to the reference and merged by platform using a UNION strategy that preserves variant diversity (Module 1). Each platform is imputed separately on the TOPMed, Michigan and/or All of Us (AnVIL) imputation servers through automated job submission and retrieval (Module 2), filtered with the ancestry-aware MagicalRsq-X quality metric rather than a fixed R² cut-off (Module 3), harmonized and INTERSECTION-merged across platforms (Module 4), optionally re-imputed to recover variants lost at the intersection (Module 5), and passed through final sample- and variant-level QC including Hardy–Weinberg, minor allele frequency, heterozygosity, sex-check, relatedness and principal-component analyses (Module 6). Global ancestry is inferred with GRAF-anc and ADMIXTURE, and local ancestry with RFMix v2, FLARE or G-NOMIX against a 1000 Genomes–HGDP reference panel (Module 7). An optional benchmarking module compares imputed genotypes with whole-genome-sequencing truth, contrasts six QC/merge strategies across three imputation servers, and simulates phenotypes with GCTA to quantify GWAS power, hit recovery and local-ancestry accuracy within each ancestry group (Module 8; inset panels are illustrative). The output is an analysis-ready genotype set with global ancestry calls and local ancestry tracts.</w:t>
-      </w:r>
-    </w:p>
-    <w:p>
-      <w:pPr>
-        <w:spacing w:after="120"/>
-      </w:pPr>
-      <w:r>
-        <w:rPr>
-          <w:b w:val="0"/>
-          <w:sz w:val="18"/>
-        </w:rPr>
-      </w:r>
-      <w:r>
-        <w:rPr>
-          <w:b/>
-          <w:sz w:val="18"/>
-        </w:rPr>
-        <w:t>(B)</w:t>
-      </w:r>
-      <w:r>
-        <w:rPr>
-          <w:b w:val="0"/>
-          <w:sz w:val="18"/>
-        </w:rPr>
-        <w:t xml:space="preserve"> Ancestry-aware GWAS and downstream analyses (Nextflow_GWAS_pipeline). Harmonized genotypes, phenotypes and ancestry calls from (A) are QC'd and stratified into major and admixed ancestry groups, and GWAS is run in parallel per group and trait with REGENIE, SAIGE, BOLT-LMM, PLINK2 or GENESIS mixed models; admixed groups are additionally analysed with Tractor, which decomposes effects by local ancestry (two-way for African American, three-way for Latino participants), and time-to-event outcomes with SPA-Cox. Group-level results are combined with MR-MEGA meta-regression, which models ancestry-correlated heterogeneity, then fine-mapped within ancestry (PolyFun + SuSiE) and across ancestries (MG-FLASH-FM, SuSiE-ME). Downstream subworkflows compute ancestry-aware polygenic risk scores (PRS-CSx, PRS-CS, GAUDI, LDpred2), heritability and cross-ancestry genetic correlation (LDSC, GCTA), colocalization with ancestry-matched QTL resources, and functional annotation (MAGMA, FUMA, LAVA, FLAMES), followed by visualization and automated reporting. Every module in both pipelines is an independent Nextflow DSL2 entry point, so the framework can be run end-to-end or any module can be run alone on existing outputs; dashed outlines mark optional modules and orange marks admixed-population methods. </w:t>
-      </w:r>
-      <w:r>
-        <w:rPr>
-          <w:b/>
-          <w:sz w:val="18"/>
-        </w:rPr>
-        <w:t>(C)</w:t>
-      </w:r>
-      <w:r>
-        <w:rPr>
-          <w:b w:val="0"/>
-          <w:sz w:val="18"/>
-        </w:rPr>
-        <w:t xml:space="preserve"> Principal departures from a typical GWAS workflow: end-to-end containerized merging instead of cohort-specific scripts; two-step imputation against the diverse TOPMed and All of Us AnVIL panels rather than a single largely European panel; ancestry-aware MagicalRsq-X filtering instead of a fixed R² cut-off; GRAF-anc plus local ancestry inference instead of self-report or global principal components; benchmarking built into the workflow; and containerized, parallelized, portable execution on HPC/SLURM.</w:t>
-      </w:r>
-    </w:p>
     <w:sectPr>
-      <w:pgSz w:w="15840" w:h="12240"/>
+      <w:pgSz w:w="15840" w:h="12240" w:orient="landscape"/>
       <w:pgMar w:top="1080" w:right="1080" w:bottom="1080" w:left="1080" w:header="720" w:footer="720" w:gutter="0"/>
       <w:cols w:space="720"/>
       <w:docGrid w:linePitch="360"/>

</xml_diff>

<commit_message>
Refine cancer schematic: unified palette, larger text, workflow scoring
Replaces the mixed pastel palette with one cool-to-violet pipeline ramp
plus two saturated cohort accents (benchmark blue, cancer orange).
Increases card padding and body text size/weight, names the real
genotyping platforms (GSA v1/v2, Affymetrix 500K and SNP6), and adds
scoring of the six preprocessing workflows on recovery of known ALL loci
and signal-to-noise for novel hits. Caption extended to cover diverse
cancer cohorts and the REDIAL test case.

Co-Authored-By: Claude Opus 5 <noreply@anthropic.com>
Claude-Session: https://claude.ai/code/session_018QsH3eLkvymJ4uH9sH99fS
</commit_message>
<xml_diff>
--- a/docs/figures/pipeline_schematic_figure.docx
+++ b/docs/figures/pipeline_schematic_figure.docx
@@ -7,14 +7,14 @@
         <w:pStyle w:val="Heading1"/>
       </w:pPr>
       <w:r>
-        <w:t>Option 3: cancer application (benchmark + REDIAL streams)</w:t>
+        <w:t>Option 3: cancer application (benchmark + REDIAL/COG streams)</w:t>
       </w:r>
     </w:p>
     <w:p>
       <w:r>
         <w:drawing>
           <wp:inline xmlns:a="http://schemas.openxmlformats.org/drawingml/2006/main" xmlns:pic="http://schemas.openxmlformats.org/drawingml/2006/picture">
-            <wp:extent cx="8686800" cy="4864608"/>
+            <wp:extent cx="8961120" cy="4953055"/>
             <wp:docPr id="1" name="Picture 1"/>
             <wp:cNvGraphicFramePr>
               <a:graphicFrameLocks noChangeAspect="1"/>
@@ -35,7 +35,7 @@
                   <pic:spPr>
                     <a:xfrm>
                       <a:off x="0" y="0"/>
-                      <a:ext cx="8686800" cy="4864608"/>
+                      <a:ext cx="8961120" cy="4953055"/>
                     </a:xfrm>
                     <a:prstGeom prst="rect"/>
                   </pic:spPr>
@@ -68,7 +68,7 @@
           <w:b w:val="0"/>
           <w:sz w:val="18"/>
         </w:rPr>
-        <w:t xml:space="preserve"> (A) Key differences between a typical GWAS workflow and this framework, for genotype harmonization and for association and downstream analysis. (B) Genotype harmonization, quality control and ancestry inference. Two data streams enter the same pipeline: a benchmarking stream of 1000 Genomes samples genotyped on multiple SNP arrays with matched whole-genome sequencing (WGS) truth plus simulated phenotypes, and the REDIAL (Reducing Ethnic Disparities in Acute Leukemias) cohort of children with acute lymphoblastic leukemia (ALL) from eight sites in Texas and California, genotyped on Illumina GSA v1/v2 arrays with overlapping germline WGS. Genotypes are lifted over, aligned and union-merged, imputed on the TOPMed, Michigan and All of Us servers, filtered with the ancestry-aware MagicalRsq-X metric, merged and passed through final QC, then assigned global (GRAF-anc) and local (RFMix) ancestry. The benchmarking stream, and the WGS-array overlap within REDIAL, allow imputation accuracy and simulated GWAS power to be quantified within each ancestry group before the pipeline is applied to cancer outcomes (insets illustrative). (C) Ancestry-aware GWAS and downstream analysis. Harmonized genotypes are stratified into GRAF-anc ancestry groups and analysed per ancestry and trait with REGENIE, SAIGE, GENESIS or Tractor, including time-to-event GWAS that incorporates local ancestry; results are combined by MR-MEGA-env meta-regression, fine-mapped within and across ancestries and traits (PolyFun + SuSiE, MG-FLASH-FM), and carried into ancestry-aware polygenic scores, heritability, colocalization and annotation. For REDIAL this yields ancestry-resolved germline associations with ALL risk and outcomes across a cohort in which genetic ancestry, self-reported race and ethnicity and clinical factors are known to interact (Kore et al., Cancer Epidemiol Biomarkers Prev 2026;35:710-717); the benchmarking stream yields accuracy and power estimates by ancestry. Every step is an independent, containerized Nextflow entry point; dashed outlines mark optional steps.</w:t>
+        <w:t xml:space="preserve"> (A) Key differences between a typical GWAS workflow and this framework, for genotype harmonization and for association and downstream analysis. (B) Genotype harmonization, quality control and ancestry inference. Two data streams enter the same pipeline: a benchmarking stream of 1000 Genomes samples genotyped on multiple SNP arrays with matched whole-genome sequencing (WGS) truth plus simulated phenotypes, and a pediatric acute lymphoblastic leukemia (ALL) stream comprising the REDIAL (Reducing Ethnic Disparities in Acute Leukemias) cohort on Illumina GSA v1/v2 arrays together with Children's Oncology Group and St. Jude cohorts on Affymetrix 500K and SNP6 arrays, a subset of which also has germline WGS. Genotypes are lifted over, aligned and union-merged, imputed on the TOPMed, Michigan and All of Us servers, filtered with the ancestry-aware MagicalRsq-X metric, merged and passed through final QC, then assigned global (GRAF-anc) and local (RFMix) ancestry. Six alternative preprocessing workflows are run across these platforms and scored against WGS truth, simulated phenotypes and recovery of established ALL loci, so that the best workflow can be selected per platform rather than assumed (insets illustrative). (C) Ancestry-aware GWAS and downstream analysis. Harmonized genotypes are stratified into GRAF-anc ancestry groups and analysed per ancestry and trait with REGENIE, SAIGE, GENESIS or Tractor, including time-to-event GWAS that incorporates local ancestry; results are combined by MR-MEGA-env meta-regression, fine-mapped within and across ancestries and traits (PolyFun + SuSiE, MG-FLASH-FM), and carried into ancestry-aware polygenic scores, heritability, colocalization and annotation. Every step is an independent, containerized Nextflow entry point; dashed outlines mark optional steps. Together these components address a central obstacle to cancer genomic studies in diverse cohorts: array- and ancestry-dependent imputation loss that removes exactly the variants most informative in underrepresented populations, where risk alleles for minimal residual disease and relapse are often enriched. REDIAL provides an empirical, real-world test case: because established germline associations with minimal residual disease (IL15, GATA3) and relapse (PYGL, PDE4B) are already known, each workflow can be judged on whether it recovers these signals and improves the signal-to-noise ratio for novel hits across genotyping platforms and ancestry groups, giving an objective basis for extending the framework to other diverse cancer cohorts.</w:t>
       </w:r>
     </w:p>
     <w:p>
@@ -81,14 +81,14 @@
         <w:pStyle w:val="Heading1"/>
       </w:pPr>
       <w:r>
-        <w:t>Option 1: landscape</w:t>
+        <w:t>Option 1: landscape (no cohort streams)</w:t>
       </w:r>
     </w:p>
     <w:p>
       <w:r>
         <w:drawing>
           <wp:inline xmlns:a="http://schemas.openxmlformats.org/drawingml/2006/main" xmlns:pic="http://schemas.openxmlformats.org/drawingml/2006/picture">
-            <wp:extent cx="8686800" cy="4412894"/>
+            <wp:extent cx="8961120" cy="4659782"/>
             <wp:docPr id="2" name="Picture 2"/>
             <wp:cNvGraphicFramePr>
               <a:graphicFrameLocks noChangeAspect="1"/>
@@ -109,7 +109,7 @@
                   <pic:spPr>
                     <a:xfrm>
                       <a:off x="0" y="0"/>
-                      <a:ext cx="8686800" cy="4412894"/>
+                      <a:ext cx="8961120" cy="4659782"/>
                     </a:xfrm>
                     <a:prstGeom prst="rect"/>
                   </pic:spPr>
@@ -236,7 +236,7 @@
       <w:r>
         <w:drawing>
           <wp:inline xmlns:a="http://schemas.openxmlformats.org/drawingml/2006/main" xmlns:pic="http://schemas.openxmlformats.org/drawingml/2006/picture">
-            <wp:extent cx="5852160" cy="6411332"/>
+            <wp:extent cx="5669280" cy="6619107"/>
             <wp:docPr id="3" name="Picture 3"/>
             <wp:cNvGraphicFramePr>
               <a:graphicFrameLocks noChangeAspect="1"/>
@@ -257,7 +257,7 @@
                   <pic:spPr>
                     <a:xfrm>
                       <a:off x="0" y="0"/>
-                      <a:ext cx="5852160" cy="6411332"/>
+                      <a:ext cx="5669280" cy="6619107"/>
                     </a:xfrm>
                     <a:prstGeom prst="rect"/>
                   </pic:spPr>
@@ -270,7 +270,7 @@
     </w:p>
     <w:sectPr>
       <w:pgSz w:w="15840" w:h="12240" w:orient="landscape"/>
-      <w:pgMar w:top="1080" w:right="1080" w:bottom="1080" w:left="1080" w:header="720" w:footer="720" w:gutter="0"/>
+      <w:pgMar w:top="864" w:right="864" w:bottom="864" w:left="864" w:header="720" w:footer="720" w:gutter="0"/>
       <w:cols w:space="720"/>
       <w:docGrid w:linePitch="360"/>
     </w:sectPr>

</xml_diff>

<commit_message>
Rework schematic: workflow variants in B, cohort outcomes in C
Panel B benchmarking now shows the workflow variants (QC and merge
timing, R2 vs MagicalRsq-X, one- vs two-step imputation) scored by
concordance with WGS truth by ancestry, reference panel choice and
simulated GWAS power. Recovery of known ALL outcome loci and
signal-to-noise for novel hits move to Panel C as cohort outcomes.
Adds user-supplied reference panels for imputation and local ancestry,
rebuilds the palette as one cool ramp with cohort accents, features
Panel A with a heavier frame, and stops short steps being stretched.

Co-Authored-By: Claude Opus 5 <noreply@anthropic.com>
Claude-Session: https://claude.ai/code/session_018QsH3eLkvymJ4uH9sH99fS
</commit_message>
<xml_diff>
--- a/docs/figures/pipeline_schematic_figure.docx
+++ b/docs/figures/pipeline_schematic_figure.docx
@@ -14,7 +14,7 @@
       <w:r>
         <w:drawing>
           <wp:inline xmlns:a="http://schemas.openxmlformats.org/drawingml/2006/main" xmlns:pic="http://schemas.openxmlformats.org/drawingml/2006/picture">
-            <wp:extent cx="8961120" cy="4953055"/>
+            <wp:extent cx="8961120" cy="5930632"/>
             <wp:docPr id="1" name="Picture 1"/>
             <wp:cNvGraphicFramePr>
               <a:graphicFrameLocks noChangeAspect="1"/>
@@ -35,7 +35,7 @@
                   <pic:spPr>
                     <a:xfrm>
                       <a:off x="0" y="0"/>
-                      <a:ext cx="8961120" cy="4953055"/>
+                      <a:ext cx="8961120" cy="5930632"/>
                     </a:xfrm>
                     <a:prstGeom prst="rect"/>
                   </pic:spPr>
@@ -68,7 +68,7 @@
           <w:b w:val="0"/>
           <w:sz w:val="18"/>
         </w:rPr>
-        <w:t xml:space="preserve"> (A) Key differences between a typical GWAS workflow and this framework, for genotype harmonization and for association and downstream analysis. (B) Genotype harmonization, quality control and ancestry inference. Two data streams enter the same pipeline: a benchmarking stream of 1000 Genomes samples genotyped on multiple SNP arrays with matched whole-genome sequencing (WGS) truth plus simulated phenotypes, and a pediatric acute lymphoblastic leukemia (ALL) stream comprising the REDIAL (Reducing Ethnic Disparities in Acute Leukemias) cohort on Illumina GSA v1/v2 arrays together with Children's Oncology Group and St. Jude cohorts on Affymetrix 500K and SNP6 arrays, a subset of which also has germline WGS. Genotypes are lifted over, aligned and union-merged, imputed on the TOPMed, Michigan and All of Us servers, filtered with the ancestry-aware MagicalRsq-X metric, merged and passed through final QC, then assigned global (GRAF-anc) and local (RFMix) ancestry. Six alternative preprocessing workflows are run across these platforms and scored against WGS truth, simulated phenotypes and recovery of established ALL loci, so that the best workflow can be selected per platform rather than assumed (insets illustrative). (C) Ancestry-aware GWAS and downstream analysis. Harmonized genotypes are stratified into GRAF-anc ancestry groups and analysed per ancestry and trait with REGENIE, SAIGE, GENESIS or Tractor, including time-to-event GWAS that incorporates local ancestry; results are combined by MR-MEGA-env meta-regression, fine-mapped within and across ancestries and traits (PolyFun + SuSiE, MG-FLASH-FM), and carried into ancestry-aware polygenic scores, heritability, colocalization and annotation. Every step is an independent, containerized Nextflow entry point; dashed outlines mark optional steps. Together these components address a central obstacle to cancer genomic studies in diverse cohorts: array- and ancestry-dependent imputation loss that removes exactly the variants most informative in underrepresented populations, where risk alleles for minimal residual disease and relapse are often enriched. REDIAL provides an empirical, real-world test case: because established germline associations with minimal residual disease (IL15, GATA3) and relapse (PYGL, PDE4B) are already known, each workflow can be judged on whether it recovers these signals and improves the signal-to-noise ratio for novel hits across genotyping platforms and ancestry groups, giving an objective basis for extending the framework to other diverse cancer cohorts.</w:t>
+        <w:t xml:space="preserve"> (A) Key differences between a typical GWAS workflow and this framework, for genotype harmonization and for association and downstream analysis. (B) Genotype harmonization, quality control and ancestry inference. Two data streams enter the same pipeline: a benchmarking stream of 1000 Genomes samples genotyped on multiple SNP arrays with matched whole-genome sequencing (WGS) truth plus simulated phenotypes, and a pediatric acute lymphoblastic leukemia (ALL) stream comprising the REDIAL (Reducing Ethnic Disparities in Acute Leukemias) cohort on Illumina GSA v1/v2 arrays together with Children's Oncology Group and St. Jude cohorts on Affymetrix 500K and SNP6 arrays, a subset of which also has germline WGS. Genotypes are lifted over, aligned and union-merged, imputed against TOPMed, All of Us, Michigan or a user-supplied reference panel in one or two steps, filtered with the ancestry-aware MagicalRsq-X metric, merged and passed through final QC, then assigned global (GRAF-anc) and local (RFMix) ancestry; because local ancestry accuracy depends strongly on how well the reference panel matches the population under study, population-specific panels can be wired in at both the imputation and local-ancestry steps. Six workflow variants are run in parallel across platforms, differing in the timing and stringency of QC and of platform merging relative to imputation, in fixed R² versus MagicalRsq-X filtering, and in one- versus two-step imputation. Merging before imputation can imprint array-specific artifacts and yield sparse, platform-driven signal, whereas two-step imputation retains rarer and more ancestry-specific variants. Variants are scored by concordance with WGS truth within each ancestry group, by reference panel, and by simulated GWAS power under varying ancestry-specific effect sizes, allele frequencies and heritabilities, identifying which panels and workflows perform best in diverse cohorts and which ancestry groups remain limited by available reference data (insets illustrative). (C) Ancestry-aware GWAS and downstream analysis. Harmonized genotypes are stratified into GRAF-anc ancestry groups and analysed per ancestry and trait with REGENIE, SAIGE, GENESIS or Tractor, including time-to-event GWAS that incorporates local ancestry; results are combined by MR-MEGA-env meta-regression, fine-mapped within and across ancestries and traits (PolyFun + SuSiE, MG-FLASH-FM), and carried into ancestry-aware polygenic scores, heritability, colocalization and annotation. Every step is an independent, containerized Nextflow entry point; dashed outlines mark optional steps. Together these components address a central obstacle to cancer genomic studies in diverse cohorts: array- and ancestry-dependent imputation loss that removes exactly the variants most informative in underrepresented populations, where risk alleles for minimal residual disease and relapse are often enriched. REDIAL provides an empirical, real-world test case: germline associations with minimal residual disease (IL15, GATA3) and relapse (PYGL, PDE4B) are already established and show marked differences in risk allele frequency across ancestry groups, so each workflow variant can be judged on whether it recovers these signals and improves the signal-to-noise ratio for novel hits across genotyping platforms and ancestries, giving an objective basis for extending the framework to other diverse cancer cohorts.</w:t>
       </w:r>
     </w:p>
     <w:p>
@@ -88,7 +88,7 @@
       <w:r>
         <w:drawing>
           <wp:inline xmlns:a="http://schemas.openxmlformats.org/drawingml/2006/main" xmlns:pic="http://schemas.openxmlformats.org/drawingml/2006/picture">
-            <wp:extent cx="8961120" cy="4659782"/>
+            <wp:extent cx="8961120" cy="5559374"/>
             <wp:docPr id="2" name="Picture 2"/>
             <wp:cNvGraphicFramePr>
               <a:graphicFrameLocks noChangeAspect="1"/>
@@ -109,7 +109,7 @@
                   <pic:spPr>
                     <a:xfrm>
                       <a:off x="0" y="0"/>
-                      <a:ext cx="8961120" cy="4659782"/>
+                      <a:ext cx="8961120" cy="5559374"/>
                     </a:xfrm>
                     <a:prstGeom prst="rect"/>
                   </pic:spPr>
@@ -236,7 +236,7 @@
       <w:r>
         <w:drawing>
           <wp:inline xmlns:a="http://schemas.openxmlformats.org/drawingml/2006/main" xmlns:pic="http://schemas.openxmlformats.org/drawingml/2006/picture">
-            <wp:extent cx="5669280" cy="6619107"/>
+            <wp:extent cx="5486400" cy="6399660"/>
             <wp:docPr id="3" name="Picture 3"/>
             <wp:cNvGraphicFramePr>
               <a:graphicFrameLocks noChangeAspect="1"/>
@@ -257,7 +257,7 @@
                   <pic:spPr>
                     <a:xfrm>
                       <a:off x="0" y="0"/>
-                      <a:ext cx="5669280" cy="6619107"/>
+                      <a:ext cx="5486400" cy="6399660"/>
                     </a:xfrm>
                     <a:prstGeom prst="rect"/>
                   </pic:spPr>

</xml_diff>

<commit_message>
Move benchmark result to Panel B; REDIAL outcome GWAS in Panel C
The benchmarking conclusion (best workflow and reference panel per
platform, ancestries needing better panels) now sits at the end of
Panel B where the benchmarking happens. Panel C ends in a REDIAL
outcome-GWAS card with schematic Manhattan plots for relapse, minimal
residual disease, overall survival and toxicity, and the GWAS step now
names the time-to-event outcomes analysed with local ancestry.

Co-Authored-By: Claude Opus 5 <noreply@anthropic.com>
Claude-Session: https://claude.ai/code/session_018QsH3eLkvymJ4uH9sH99fS
</commit_message>
<xml_diff>
--- a/docs/figures/pipeline_schematic_figure.docx
+++ b/docs/figures/pipeline_schematic_figure.docx
@@ -14,7 +14,7 @@
       <w:r>
         <w:drawing>
           <wp:inline xmlns:a="http://schemas.openxmlformats.org/drawingml/2006/main" xmlns:pic="http://schemas.openxmlformats.org/drawingml/2006/picture">
-            <wp:extent cx="8961120" cy="5930632"/>
+            <wp:extent cx="8961120" cy="5376672"/>
             <wp:docPr id="1" name="Picture 1"/>
             <wp:cNvGraphicFramePr>
               <a:graphicFrameLocks noChangeAspect="1"/>
@@ -35,7 +35,7 @@
                   <pic:spPr>
                     <a:xfrm>
                       <a:off x="0" y="0"/>
-                      <a:ext cx="8961120" cy="5930632"/>
+                      <a:ext cx="8961120" cy="5376672"/>
                     </a:xfrm>
                     <a:prstGeom prst="rect"/>
                   </pic:spPr>
@@ -61,14 +61,14 @@
           <w:b/>
           <w:sz w:val="18"/>
         </w:rPr>
-        <w:t>Figure 1. A modular, ancestry-aware framework for germline genotype harmonization and GWAS, benchmarked on public and simulated data and applied to the REDIAL pediatric leukemia cohort.</w:t>
+        <w:t>Figure 1. A modular, ancestry-aware framework for germline genotype harmonization and GWAS, benchmarked on public and simulated data and applied to outcome analysis in the REDIAL pediatric leukemia cohort.</w:t>
       </w:r>
       <w:r>
         <w:rPr>
           <w:b w:val="0"/>
           <w:sz w:val="18"/>
         </w:rPr>
-        <w:t xml:space="preserve"> (A) Key differences between a typical GWAS workflow and this framework, for genotype harmonization and for association and downstream analysis. (B) Genotype harmonization, quality control and ancestry inference. Two data streams enter the same pipeline: a benchmarking stream of 1000 Genomes samples genotyped on multiple SNP arrays with matched whole-genome sequencing (WGS) truth plus simulated phenotypes, and a pediatric acute lymphoblastic leukemia (ALL) stream comprising the REDIAL (Reducing Ethnic Disparities in Acute Leukemias) cohort on Illumina GSA v1/v2 arrays together with Children's Oncology Group and St. Jude cohorts on Affymetrix 500K and SNP6 arrays, a subset of which also has germline WGS. Genotypes are lifted over, aligned and union-merged, imputed against TOPMed, All of Us, Michigan or a user-supplied reference panel in one or two steps, filtered with the ancestry-aware MagicalRsq-X metric, merged and passed through final QC, then assigned global (GRAF-anc) and local (RFMix) ancestry; because local ancestry accuracy depends strongly on how well the reference panel matches the population under study, population-specific panels can be wired in at both the imputation and local-ancestry steps. Six workflow variants are run in parallel across platforms, differing in the timing and stringency of QC and of platform merging relative to imputation, in fixed R² versus MagicalRsq-X filtering, and in one- versus two-step imputation. Merging before imputation can imprint array-specific artifacts and yield sparse, platform-driven signal, whereas two-step imputation retains rarer and more ancestry-specific variants. Variants are scored by concordance with WGS truth within each ancestry group, by reference panel, and by simulated GWAS power under varying ancestry-specific effect sizes, allele frequencies and heritabilities, identifying which panels and workflows perform best in diverse cohorts and which ancestry groups remain limited by available reference data (insets illustrative). (C) Ancestry-aware GWAS and downstream analysis. Harmonized genotypes are stratified into GRAF-anc ancestry groups and analysed per ancestry and trait with REGENIE, SAIGE, GENESIS or Tractor, including time-to-event GWAS that incorporates local ancestry; results are combined by MR-MEGA-env meta-regression, fine-mapped within and across ancestries and traits (PolyFun + SuSiE, MG-FLASH-FM), and carried into ancestry-aware polygenic scores, heritability, colocalization and annotation. Every step is an independent, containerized Nextflow entry point; dashed outlines mark optional steps. Together these components address a central obstacle to cancer genomic studies in diverse cohorts: array- and ancestry-dependent imputation loss that removes exactly the variants most informative in underrepresented populations, where risk alleles for minimal residual disease and relapse are often enriched. REDIAL provides an empirical, real-world test case: germline associations with minimal residual disease (IL15, GATA3) and relapse (PYGL, PDE4B) are already established and show marked differences in risk allele frequency across ancestry groups, so each workflow variant can be judged on whether it recovers these signals and improves the signal-to-noise ratio for novel hits across genotyping platforms and ancestries, giving an objective basis for extending the framework to other diverse cancer cohorts.</w:t>
+        <w:t xml:space="preserve"> (A) Key differences between a typical GWAS workflow and this framework, for genotype harmonization and for association and downstream analysis. (B) Genotype harmonization, quality control and ancestry inference. Two data streams enter the same pipeline: a benchmarking stream of 1000 Genomes samples genotyped on multiple SNP arrays with matched whole-genome sequencing (WGS) truth plus simulated phenotypes, and a pediatric acute lymphoblastic leukemia (ALL) stream comprising the REDIAL (Reducing Ethnic Disparities in Acute Leukemias) cohort on Illumina GSA v1/v2 arrays together with Children's Oncology Group and St. Jude cohorts on Affymetrix 500K and SNP6 arrays, a subset of which also has germline WGS. Genotypes are lifted over, aligned and union-merged, imputed against TOPMed, All of Us, Michigan or a user-supplied reference panel in one or two steps, filtered with the ancestry-aware MagicalRsq-X metric, merged and passed through final QC, then assigned global (GRAF-anc) and local (RFMix) ancestry; because local ancestry accuracy depends strongly on how closely the reference panel matches the population under study, population-specific panels can be supplied at both the imputation and local-ancestry steps. Six workflow variants are run in parallel across platforms, differing in the timing and stringency of QC and of platform merging relative to imputation, in fixed R² versus MagicalRsq-X filtering, and in one- versus two-step imputation: merging before imputation can imprint array-specific artifacts and yield sparse, platform-driven signal, whereas two-step imputation retains rarer and more ancestry-specific variants. Variants are scored by concordance with WGS truth within each ancestry group, by reference panel, and by simulated GWAS power under varying ancestry-specific effect sizes, allele frequencies and heritabilities, yielding the best workflow and reference panel for each genotyping platform and identifying which ancestry groups remain limited by available reference data (insets illustrative). (C) Ancestry-aware GWAS and downstream analysis. Harmonized genotypes are stratified into GRAF-anc ancestry groups and analysed per ancestry and trait with REGENIE, SAIGE, GENESIS or Tractor; because ancestry is estimated within the same framework, time-to-event models can incorporate local ancestry, enabling clinically relevant outcome GWAS for overall survival, disease-free survival, relapse, minimal residual disease and treatment toxicity in diverse and admixed cohorts. Results are combined by MR-MEGA-env meta-regression, fine-mapped within and across ancestries and traits (PolyFun + SuSiE, MG-FLASH-FM), and carried into ancestry-aware polygenic scores, heritability, colocalization and annotation. Every step is an independent, containerized Nextflow entry point; dashed outlines mark optional steps. Together these components address a central obstacle to cancer genomic studies in diverse cohorts: array- and ancestry-dependent imputation loss that removes exactly the variants most informative in underrepresented populations, where risk alleles for minimal residual disease and relapse are often enriched. REDIAL provides an empirical, real-world test case linking the two halves of the framework: germline associations with minimal residual disease (IL15, GATA3) and relapse (PYGL, PDE4B) are already established and show marked differences in risk allele frequency across ancestry groups, so upstream workflow choices can be judged by whether the resulting outcome GWAS recover these signals and improve the signal-to-noise ratio for novel, ancestry-resolved hits across genotyping platforms. This provides direct evidence for the value of ancestry-specific tools in admixed cohorts and an objective basis for extending the framework to other diverse cancer cohorts.</w:t>
       </w:r>
     </w:p>
     <w:p>

</xml_diff>

<commit_message>
Frame default workflow vs benchmarked harmonization variants
The pipeline default (light pre-imputation QC, two-step imputation,
MagicalRsq-X, extensive post-imputation QC) is now stated on the Panel B
steps and in a subtitle. The six variants are presented as the
unstandardized practice across published studies, benchmarked for gain
and cost by ancestry group; benchmark insets become a 2x2 grid adding
gain vs standard practice. Panel A gains QC timing and standardization
rows.

Co-Authored-By: Claude Opus 5 <noreply@anthropic.com>
Claude-Session: https://claude.ai/code/session_018QsH3eLkvymJ4uH9sH99fS
</commit_message>
<xml_diff>
--- a/docs/figures/pipeline_schematic_figure.docx
+++ b/docs/figures/pipeline_schematic_figure.docx
@@ -14,7 +14,7 @@
       <w:r>
         <w:drawing>
           <wp:inline xmlns:a="http://schemas.openxmlformats.org/drawingml/2006/main" xmlns:pic="http://schemas.openxmlformats.org/drawingml/2006/picture">
-            <wp:extent cx="8961120" cy="5376672"/>
+            <wp:extent cx="8961120" cy="5585765"/>
             <wp:docPr id="1" name="Picture 1"/>
             <wp:cNvGraphicFramePr>
               <a:graphicFrameLocks noChangeAspect="1"/>
@@ -35,7 +35,7 @@
                   <pic:spPr>
                     <a:xfrm>
                       <a:off x="0" y="0"/>
-                      <a:ext cx="8961120" cy="5376672"/>
+                      <a:ext cx="8961120" cy="5585765"/>
                     </a:xfrm>
                     <a:prstGeom prst="rect"/>
                   </pic:spPr>
@@ -68,7 +68,7 @@
           <w:b w:val="0"/>
           <w:sz w:val="18"/>
         </w:rPr>
-        <w:t xml:space="preserve"> (A) Key differences between a typical GWAS workflow and this framework, for genotype harmonization and for association and downstream analysis. (B) Genotype harmonization, quality control and ancestry inference. Two data streams enter the same pipeline: a benchmarking stream of 1000 Genomes samples genotyped on multiple SNP arrays with matched whole-genome sequencing (WGS) truth plus simulated phenotypes, and a pediatric acute lymphoblastic leukemia (ALL) stream comprising the REDIAL (Reducing Ethnic Disparities in Acute Leukemias) cohort on Illumina GSA v1/v2 arrays together with Children's Oncology Group and St. Jude cohorts on Affymetrix 500K and SNP6 arrays, a subset of which also has germline WGS. Genotypes are lifted over, aligned and union-merged, imputed against TOPMed, All of Us, Michigan or a user-supplied reference panel in one or two steps, filtered with the ancestry-aware MagicalRsq-X metric, merged and passed through final QC, then assigned global (GRAF-anc) and local (RFMix) ancestry; because local ancestry accuracy depends strongly on how closely the reference panel matches the population under study, population-specific panels can be supplied at both the imputation and local-ancestry steps. Six workflow variants are run in parallel across platforms, differing in the timing and stringency of QC and of platform merging relative to imputation, in fixed R² versus MagicalRsq-X filtering, and in one- versus two-step imputation: merging before imputation can imprint array-specific artifacts and yield sparse, platform-driven signal, whereas two-step imputation retains rarer and more ancestry-specific variants. Variants are scored by concordance with WGS truth within each ancestry group, by reference panel, and by simulated GWAS power under varying ancestry-specific effect sizes, allele frequencies and heritabilities, yielding the best workflow and reference panel for each genotyping platform and identifying which ancestry groups remain limited by available reference data (insets illustrative). (C) Ancestry-aware GWAS and downstream analysis. Harmonized genotypes are stratified into GRAF-anc ancestry groups and analysed per ancestry and trait with REGENIE, SAIGE, GENESIS or Tractor; because ancestry is estimated within the same framework, time-to-event models can incorporate local ancestry, enabling clinically relevant outcome GWAS for overall survival, disease-free survival, relapse, minimal residual disease and treatment toxicity in diverse and admixed cohorts. Results are combined by MR-MEGA-env meta-regression, fine-mapped within and across ancestries and traits (PolyFun + SuSiE, MG-FLASH-FM), and carried into ancestry-aware polygenic scores, heritability, colocalization and annotation. Every step is an independent, containerized Nextflow entry point; dashed outlines mark optional steps. Together these components address a central obstacle to cancer genomic studies in diverse cohorts: array- and ancestry-dependent imputation loss that removes exactly the variants most informative in underrepresented populations, where risk alleles for minimal residual disease and relapse are often enriched. REDIAL provides an empirical, real-world test case linking the two halves of the framework: germline associations with minimal residual disease (IL15, GATA3) and relapse (PYGL, PDE4B) are already established and show marked differences in risk allele frequency across ancestry groups, so upstream workflow choices can be judged by whether the resulting outcome GWAS recover these signals and improve the signal-to-noise ratio for novel, ancestry-resolved hits across genotyping platforms. This provides direct evidence for the value of ancestry-specific tools in admixed cohorts and an objective basis for extending the framework to other diverse cancer cohorts.</w:t>
+        <w:t xml:space="preserve"> (A) Key differences between a typical GWAS workflow and this framework, for genotype harmonization and for association and downstream analysis. (B) Genotype harmonization, quality control and ancestry inference. Two data streams enter the same pipeline: a benchmarking stream of 1000 Genomes samples genotyped on multiple SNP arrays with matched whole-genome sequencing (WGS) truth plus simulated phenotypes, and a pediatric acute lymphoblastic leukemia (ALL) stream comprising the REDIAL (Reducing Ethnic Disparities in Acute Leukemias) cohort on Illumina GSA v1/v2 arrays together with Children's Oncology Group and St. Jude cohorts on Affymetrix 500K and SNP6 arrays, a subset of which also has germline WGS. The default workflow applies light pre-imputation quality control, two-step imputation against TOPMed, All of Us, Michigan or a user-supplied reference panel, ancestry-aware MagicalRsq-X filtering in place of a fixed R² cut-off, and extensive post-imputation quality control before platform merging, followed by global (GRAF-anc) and local (RFMix) ancestry inference; because local ancestry accuracy depends strongly on how closely the reference panel matches the population under study, population-specific panels can be supplied at both the imputation and local-ancestry steps. Harmonization of genotyping arrays is not standardized, and published studies differ in the timing and stringency of quality control, in whether platforms are merged before or after imputation, in fixed R² versus recalibrated filtering, and in one- versus two-step imputation. Six such variants are therefore run head-to-head across platforms and scored by concordance with WGS truth within each ancestry group, by reference panel, by the gain in variants retained relative to standard practice, and by simulated GWAS power under varying ancestry-specific effect sizes, allele frequencies and heritabilities. This quantifies both the improvement and its computational cost for each ancestry group, and identifies which ancestries remain limited by available reference data (insets illustrative). (C) Ancestry-aware GWAS and downstream analysis. Harmonized genotypes are stratified into GRAF-anc ancestry groups and analysed per ancestry and trait with REGENIE, SAIGE, GENESIS or Tractor; because ancestry is estimated within the same framework, time-to-event models can incorporate local ancestry, enabling clinically relevant outcome GWAS for overall survival, disease-free survival, relapse, minimal residual disease and treatment toxicity in diverse and admixed cohorts. Results are combined by MR-MEGA-env meta-regression, fine-mapped within and across ancestries and traits (PolyFun + SuSiE, MG-FLASH-FM), and carried into ancestry-aware polygenic scores, heritability, colocalization and annotation. Every step is an independent, containerized Nextflow entry point; dashed outlines mark optional steps. Together these components address a central obstacle to cancer genomic studies in diverse cohorts: array- and ancestry-dependent imputation loss that removes exactly the variants most informative in underrepresented populations, where risk alleles for minimal residual disease and relapse are often enriched. REDIAL provides an empirical, real-world test case linking the two halves of the framework: germline associations with minimal residual disease (IL15, GATA3) and relapse (PYGL, PDE4B) are already established and show marked differences in risk allele frequency across ancestry groups, so upstream harmonization choices can be judged by whether the resulting outcome GWAS recover these signals and improve the signal-to-noise ratio for novel, ancestry-resolved hits across genotyping platforms. This provides direct evidence for the value of ancestry-specific tools in admixed cohorts and an objective basis for extending the framework to other diverse cancer cohorts.</w:t>
       </w:r>
     </w:p>
     <w:p>
@@ -88,7 +88,7 @@
       <w:r>
         <w:drawing>
           <wp:inline xmlns:a="http://schemas.openxmlformats.org/drawingml/2006/main" xmlns:pic="http://schemas.openxmlformats.org/drawingml/2006/picture">
-            <wp:extent cx="8961120" cy="5559374"/>
+            <wp:extent cx="8961120" cy="5802978"/>
             <wp:docPr id="2" name="Picture 2"/>
             <wp:cNvGraphicFramePr>
               <a:graphicFrameLocks noChangeAspect="1"/>
@@ -109,7 +109,7 @@
                   <pic:spPr>
                     <a:xfrm>
                       <a:off x="0" y="0"/>
-                      <a:ext cx="8961120" cy="5559374"/>
+                      <a:ext cx="8961120" cy="5802978"/>
                     </a:xfrm>
                     <a:prstGeom prst="rect"/>
                   </pic:spPr>
@@ -236,7 +236,7 @@
       <w:r>
         <w:drawing>
           <wp:inline xmlns:a="http://schemas.openxmlformats.org/drawingml/2006/main" xmlns:pic="http://schemas.openxmlformats.org/drawingml/2006/picture">
-            <wp:extent cx="5486400" cy="6399660"/>
+            <wp:extent cx="5486400" cy="6621989"/>
             <wp:docPr id="3" name="Picture 3"/>
             <wp:cNvGraphicFramePr>
               <a:graphicFrameLocks noChangeAspect="1"/>
@@ -257,7 +257,7 @@
                   <pic:spPr>
                     <a:xfrm>
                       <a:off x="0" y="0"/>
-                      <a:ext cx="5486400" cy="6399660"/>
+                      <a:ext cx="5486400" cy="6621989"/>
                     </a:xfrm>
                     <a:prstGeom prst="rect"/>
                   </pic:spPr>

</xml_diff>

<commit_message>
Scope custom reference panels to local ancestry inference
User-supplied, population-matched reference panels apply at the local
ancestry step; imputation uses TOPMed, All of Us or Michigan and is
described as extensible to new panels. Benchmark result now reads
"ancestries needing better reference populations", and result-card
bullets wrap with dynamic card height so long text is not clipped.

Co-Authored-By: Claude Opus 5 <noreply@anthropic.com>
Claude-Session: https://claude.ai/code/session_018QsH3eLkvymJ4uH9sH99fS
</commit_message>
<xml_diff>
--- a/docs/figures/pipeline_schematic_figure.docx
+++ b/docs/figures/pipeline_schematic_figure.docx
@@ -68,7 +68,7 @@
           <w:b w:val="0"/>
           <w:sz w:val="18"/>
         </w:rPr>
-        <w:t xml:space="preserve"> (A) Key differences between a typical GWAS workflow and this framework, for genotype harmonization and for association and downstream analysis. (B) Genotype harmonization, quality control and ancestry inference. Two data streams enter the same pipeline: a benchmarking stream of 1000 Genomes samples genotyped on multiple SNP arrays with matched whole-genome sequencing (WGS) truth plus simulated phenotypes, and a pediatric acute lymphoblastic leukemia (ALL) stream comprising the REDIAL (Reducing Ethnic Disparities in Acute Leukemias) cohort on Illumina GSA v1/v2 arrays together with Children's Oncology Group and St. Jude cohorts on Affymetrix 500K and SNP6 arrays, a subset of which also has germline WGS. The default workflow applies light pre-imputation quality control, two-step imputation against TOPMed, All of Us, Michigan or a user-supplied reference panel, ancestry-aware MagicalRsq-X filtering in place of a fixed R² cut-off, and extensive post-imputation quality control before platform merging, followed by global (GRAF-anc) and local (RFMix) ancestry inference; because local ancestry accuracy depends strongly on how closely the reference panel matches the population under study, population-specific panels can be supplied at both the imputation and local-ancestry steps. Harmonization of genotyping arrays is not standardized, and published studies differ in the timing and stringency of quality control, in whether platforms are merged before or after imputation, in fixed R² versus recalibrated filtering, and in one- versus two-step imputation. Six such variants are therefore run head-to-head across platforms and scored by concordance with WGS truth within each ancestry group, by reference panel, by the gain in variants retained relative to standard practice, and by simulated GWAS power under varying ancestry-specific effect sizes, allele frequencies and heritabilities. This quantifies both the improvement and its computational cost for each ancestry group, and identifies which ancestries remain limited by available reference data (insets illustrative). (C) Ancestry-aware GWAS and downstream analysis. Harmonized genotypes are stratified into GRAF-anc ancestry groups and analysed per ancestry and trait with REGENIE, SAIGE, GENESIS or Tractor; because ancestry is estimated within the same framework, time-to-event models can incorporate local ancestry, enabling clinically relevant outcome GWAS for overall survival, disease-free survival, relapse, minimal residual disease and treatment toxicity in diverse and admixed cohorts. Results are combined by MR-MEGA-env meta-regression, fine-mapped within and across ancestries and traits (PolyFun + SuSiE, MG-FLASH-FM), and carried into ancestry-aware polygenic scores, heritability, colocalization and annotation. Every step is an independent, containerized Nextflow entry point; dashed outlines mark optional steps. Together these components address a central obstacle to cancer genomic studies in diverse cohorts: array- and ancestry-dependent imputation loss that removes exactly the variants most informative in underrepresented populations, where risk alleles for minimal residual disease and relapse are often enriched. REDIAL provides an empirical, real-world test case linking the two halves of the framework: germline associations with minimal residual disease (IL15, GATA3) and relapse (PYGL, PDE4B) are already established and show marked differences in risk allele frequency across ancestry groups, so upstream harmonization choices can be judged by whether the resulting outcome GWAS recover these signals and improve the signal-to-noise ratio for novel, ancestry-resolved hits across genotyping platforms. This provides direct evidence for the value of ancestry-specific tools in admixed cohorts and an objective basis for extending the framework to other diverse cancer cohorts.</w:t>
+        <w:t xml:space="preserve"> (A) Key differences between a typical GWAS workflow and this framework, for genotype harmonization and for association and downstream analysis. (B) Genotype harmonization, quality control and ancestry inference. Two data streams enter the same pipeline: a benchmarking stream of 1000 Genomes samples genotyped on multiple SNP arrays with matched whole-genome sequencing (WGS) truth plus simulated phenotypes, and a pediatric acute lymphoblastic leukemia (ALL) stream comprising the REDIAL (Reducing Ethnic Disparities in Acute Leukemias) cohort on Illumina GSA v1/v2 arrays together with Children's Oncology Group and St. Jude cohorts on Affymetrix 500K and SNP6 arrays, a subset of which also has germline WGS. The default workflow applies light pre-imputation quality control, two-step imputation against the TOPMed, All of Us or Michigan reference panels, ancestry-aware MagicalRsq-X filtering in place of a fixed R² cut-off, and extensive post-imputation quality control before platform merging, followed by global (GRAF-anc) and local (RFMix) ancestry inference. Because local ancestry accuracy depends strongly on how closely the reference haplotypes match the population under study, users can supply their own population-matched reference panels at the local-ancestry step; the imputation step is written to accommodate additional public panels as they become available, such as South Asian-specific resources. Harmonization of genotyping arrays is not standardized, and published studies differ in the timing and stringency of quality control, in whether platforms are merged before or after imputation, in fixed R² versus recalibrated filtering, and in one- versus two-step imputation. Six such variants are therefore run head-to-head across platforms and scored by concordance with WGS truth within each ancestry group, by reference panel, by the gain in variants retained relative to standard practice, and by simulated GWAS power under varying ancestry-specific effect sizes, allele frequencies and heritabilities. This quantifies both the improvement and its computational cost for each ancestry group, and identifies which ancestry groups remain limited by the available reference populations (insets illustrative). (C) Ancestry-aware GWAS and downstream analysis. Harmonized genotypes are stratified into GRAF-anc ancestry groups and analysed per ancestry and trait with REGENIE, SAIGE, GENESIS or Tractor; because ancestry is estimated within the same framework, time-to-event models can incorporate local ancestry, enabling clinically relevant outcome GWAS for overall survival, disease-free survival, relapse, minimal residual disease and treatment toxicity in diverse and admixed cohorts. Results are combined by MR-MEGA-env meta-regression, fine-mapped within and across ancestries and traits (PolyFun + SuSiE, MG-FLASH-FM), and carried into ancestry-aware polygenic scores, heritability, colocalization and annotation. Every step is an independent, containerized Nextflow entry point; dashed outlines mark optional steps. Together these components address a central obstacle to cancer genomic studies in diverse cohorts: array- and ancestry-dependent imputation loss that removes exactly the variants most informative in underrepresented populations, where risk alleles for minimal residual disease and relapse are often enriched. REDIAL provides an empirical, real-world test case linking the two halves of the framework: germline associations with minimal residual disease (IL15, GATA3) and relapse (PYGL, PDE4B) are already established and show marked differences in risk allele frequency across ancestry groups, so upstream harmonization choices can be judged by whether the resulting outcome GWAS recover these signals and improve the signal-to-noise ratio for novel, ancestry-resolved hits across genotyping platforms. This provides direct evidence for the value of ancestry-specific tools in admixed cohorts and an objective basis for extending the framework to other diverse cancer cohorts.</w:t>
       </w:r>
     </w:p>
     <w:p>
@@ -236,7 +236,7 @@
       <w:r>
         <w:drawing>
           <wp:inline xmlns:a="http://schemas.openxmlformats.org/drawingml/2006/main" xmlns:pic="http://schemas.openxmlformats.org/drawingml/2006/picture">
-            <wp:extent cx="5486400" cy="6621989"/>
+            <wp:extent cx="5486400" cy="6707500"/>
             <wp:docPr id="3" name="Picture 3"/>
             <wp:cNvGraphicFramePr>
               <a:graphicFrameLocks noChangeAspect="1"/>
@@ -257,7 +257,7 @@
                   <pic:spPr>
                     <a:xfrm>
                       <a:off x="0" y="0"/>
-                      <a:ext cx="5486400" cy="6621989"/>
+                      <a:ext cx="5486400" cy="6707500"/>
                     </a:xfrm>
                     <a:prstGeom prst="rect"/>
                   </pic:spPr>

</xml_diff>

<commit_message>
Enlarge figure text and simplify panel headings
Panel B is retitled "Genotype harmonization, imputation, and ancestry
inference" and Panel C "Ancestry-aware GWAS & downstream analysis"; the
workflow subtitle and the footer legend are removed, and the link pill
reads "Analysis-ready genotypes & ancestry variables" on one line. Type
sizes increase throughout, most notably in Panel A, whose table rows,
headers and highlight column are enlarged to draw the eye first.

Co-Authored-By: Claude Opus 5 <noreply@anthropic.com>
Claude-Session: https://claude.ai/code/session_018QsH3eLkvymJ4uH9sH99fS
</commit_message>
<xml_diff>
--- a/docs/figures/pipeline_schematic_figure.docx
+++ b/docs/figures/pipeline_schematic_figure.docx
@@ -14,7 +14,7 @@
       <w:r>
         <w:drawing>
           <wp:inline xmlns:a="http://schemas.openxmlformats.org/drawingml/2006/main" xmlns:pic="http://schemas.openxmlformats.org/drawingml/2006/picture">
-            <wp:extent cx="8961120" cy="5585765"/>
+            <wp:extent cx="9144000" cy="5644800"/>
             <wp:docPr id="1" name="Picture 1"/>
             <wp:cNvGraphicFramePr>
               <a:graphicFrameLocks noChangeAspect="1"/>
@@ -35,7 +35,7 @@
                   <pic:spPr>
                     <a:xfrm>
                       <a:off x="0" y="0"/>
-                      <a:ext cx="8961120" cy="5585765"/>
+                      <a:ext cx="9144000" cy="5644800"/>
                     </a:xfrm>
                     <a:prstGeom prst="rect"/>
                   </pic:spPr>
@@ -68,7 +68,7 @@
           <w:b w:val="0"/>
           <w:sz w:val="18"/>
         </w:rPr>
-        <w:t xml:space="preserve"> (A) Key differences between a typical GWAS workflow and this framework, for genotype harmonization and for association and downstream analysis. (B) Genotype harmonization, quality control and ancestry inference. Two data streams enter the same pipeline: a benchmarking stream of 1000 Genomes samples genotyped on multiple SNP arrays with matched whole-genome sequencing (WGS) truth plus simulated phenotypes, and a pediatric acute lymphoblastic leukemia (ALL) stream comprising the REDIAL (Reducing Ethnic Disparities in Acute Leukemias) cohort on Illumina GSA v1/v2 arrays together with Children's Oncology Group and St. Jude cohorts on Affymetrix 500K and SNP6 arrays, a subset of which also has germline WGS. The default workflow applies light pre-imputation quality control, two-step imputation against the TOPMed, All of Us or Michigan reference panels, ancestry-aware MagicalRsq-X filtering in place of a fixed R² cut-off, and extensive post-imputation quality control before platform merging, followed by global (GRAF-anc) and local (RFMix) ancestry inference. Because local ancestry accuracy depends strongly on how closely the reference haplotypes match the population under study, users can supply their own population-matched reference panels at the local-ancestry step; the imputation step is written to accommodate additional public panels as they become available, such as South Asian-specific resources. There is no standardized genotype harmonization workflow, and published studies differ in the timing and stringency of quality control, in whether platforms are merged before or after imputation, in fixed R² versus recalibrated filtering, and in one- versus two-step imputation. Six such published workflows are therefore run head-to-head across platforms and scored by concordance with WGS truth within each ancestry group, by reference panel, by the gain in sites retained relative to standard practice, and by simulated GWAS power under varying ancestry-specific effect sizes, allele frequencies and heritabilities. This identifies the best-performing workflow for each genotyping platform, quantifies its improvement and computational cost within each ancestry group, including admixed cohorts, and shows which ancestry groups remain limited by the available reference populations (insets illustrative). (C) Ancestry-aware GWAS and downstream analysis. Harmonized genotypes are stratified into GRAF-anc ancestry groups and analysed per ancestry and trait with REGENIE, SAIGE, GENESIS or Tractor; because ancestry is estimated within the same framework, time-to-event GWAS can model local ancestry effects directly, enabling clinically relevant outcome analyses for overall survival, disease-free survival, relapse, minimal residual disease and treatment toxicity in diverse and admixed cohorts. Results are combined by MR-MEGA-env meta-regression, fine-mapped within and across ancestries and traits (PolyFun + SuSiE, MG-FLASH-FM), and carried into ancestry-aware polygenic scores, heritability, colocalization and annotation. Every step is an independent, containerized Nextflow entry point; dashed outlines mark optional steps. Together these components address a central obstacle to cancer genomic studies in diverse cohorts: array- and ancestry-dependent imputation loss that removes exactly the variants most informative in underrepresented populations, where risk alleles for minimal residual disease and relapse are often enriched. REDIAL provides an empirical, real-world test case linking the two halves of the framework: germline associations with minimal residual disease (IL15, GATA3) and relapse (PYGL, PDE4B) are already established and show marked differences in risk allele frequency across ancestry groups, so competing harmonization workflows can be judged by whether the resulting B-ALL outcome GWAS recover these signals. Panel C therefore closes with the REDIAL case example: for each outcome, the net gain in known and in novel loci detected is compared across harmonization workflows and ancestry groups, converting an upstream methodological choice into a measurable difference in discovery. This provides direct evidence for the value of ancestry-specific tools in admixed cohorts and an objective basis for extending the framework to other diverse cancer cohorts.</w:t>
+        <w:t xml:space="preserve"> (A) Key differences between a typical GWAS workflow and this framework, for genotype harmonization and for association and downstream analysis. (B) Genotype harmonization, imputation, quality control and ancestry inference. Two data streams enter the same pipeline: a benchmarking stream of 1000 Genomes samples genotyped on multiple SNP arrays with matched whole-genome sequencing (WGS) truth plus simulated phenotypes, and a pediatric acute lymphoblastic leukemia (ALL) stream comprising the REDIAL (Reducing Ethnic Disparities in Acute Leukemias) cohort on Illumina GSA v1/v2 arrays together with Children's Oncology Group and St. Jude cohorts on Affymetrix 500K and SNP6 arrays, a subset of which also has germline WGS. The default workflow applies light pre-imputation quality control, two-step imputation against the TOPMed, All of Us or Michigan reference panels, ancestry-aware MagicalRsq-X filtering in place of a fixed R² cut-off, and extensive post-imputation quality control before platform merging, followed by global (GRAF-anc) and local (RFMix) ancestry inference. Because local ancestry accuracy depends strongly on how closely the reference haplotypes match the population under study, users can supply their own population-matched reference panels at the local-ancestry step; the imputation step is written to accommodate additional public panels as they become available, such as South Asian-specific resources. There is no standardized genotype harmonization workflow, and published studies differ in the timing and stringency of quality control, in whether platforms are merged before or after imputation, in fixed R² versus recalibrated filtering, and in one- versus two-step imputation. Six such published workflows are therefore run head-to-head across platforms and scored by concordance with WGS truth within each ancestry group, by reference panel, by the gain in sites retained relative to standard practice, and by simulated GWAS power under varying ancestry-specific effect sizes, allele frequencies and heritabilities. This identifies the best-performing workflow for each genotyping platform, quantifies its improvement and computational cost within each ancestry group, including admixed cohorts, and shows which ancestry groups remain limited by the available reference populations (insets illustrative). (C) Ancestry-aware GWAS and downstream analysis. Harmonized genotypes are stratified into GRAF-anc ancestry groups and analysed per ancestry and trait with REGENIE, SAIGE, GENESIS or Tractor; because ancestry is estimated within the same framework, time-to-event GWAS can model local ancestry effects directly, enabling clinically relevant outcome analyses for overall survival, disease-free survival, relapse, minimal residual disease and treatment toxicity in diverse and admixed cohorts. Results are combined by MR-MEGA-env meta-regression, fine-mapped within and across ancestries and traits (PolyFun + SuSiE, MG-FLASH-FM), and carried into ancestry-aware polygenic scores, heritability, colocalization and annotation. Every step is an independent, containerized Nextflow entry point; dashed outlines mark optional steps. Together these components address a central obstacle to cancer genomic studies in diverse cohorts: array- and ancestry-dependent imputation loss that removes exactly the variants most informative in underrepresented populations, where risk alleles for minimal residual disease and relapse are often enriched. REDIAL provides an empirical, real-world test case linking the two halves of the framework: germline associations with minimal residual disease (IL15, GATA3) and relapse (PYGL, PDE4B) are already established and show marked differences in risk allele frequency across ancestry groups, so competing harmonization workflows can be judged by whether the resulting B-ALL outcome GWAS recover these signals. Panel C therefore closes with the REDIAL case example: for each outcome, the net gain in known and in novel loci detected is compared across harmonization workflows and ancestry groups, converting an upstream methodological choice into a measurable difference in discovery. This provides direct evidence for the value of ancestry-specific tools in admixed cohorts and an objective basis for extending the framework to other diverse cancer cohorts.</w:t>
       </w:r>
     </w:p>
     <w:p>
@@ -88,7 +88,7 @@
       <w:r>
         <w:drawing>
           <wp:inline xmlns:a="http://schemas.openxmlformats.org/drawingml/2006/main" xmlns:pic="http://schemas.openxmlformats.org/drawingml/2006/picture">
-            <wp:extent cx="8961120" cy="5802978"/>
+            <wp:extent cx="9144000" cy="5951989"/>
             <wp:docPr id="2" name="Picture 2"/>
             <wp:cNvGraphicFramePr>
               <a:graphicFrameLocks noChangeAspect="1"/>
@@ -109,7 +109,7 @@
                   <pic:spPr>
                     <a:xfrm>
                       <a:off x="0" y="0"/>
-                      <a:ext cx="8961120" cy="5802978"/>
+                      <a:ext cx="9144000" cy="5951989"/>
                     </a:xfrm>
                     <a:prstGeom prst="rect"/>
                   </pic:spPr>
@@ -236,7 +236,7 @@
       <w:r>
         <w:drawing>
           <wp:inline xmlns:a="http://schemas.openxmlformats.org/drawingml/2006/main" xmlns:pic="http://schemas.openxmlformats.org/drawingml/2006/picture">
-            <wp:extent cx="5486400" cy="6707500"/>
+            <wp:extent cx="5486400" cy="6655158"/>
             <wp:docPr id="3" name="Picture 3"/>
             <wp:cNvGraphicFramePr>
               <a:graphicFrameLocks noChangeAspect="1"/>
@@ -257,7 +257,7 @@
                   <pic:spPr>
                     <a:xfrm>
                       <a:off x="0" y="0"/>
-                      <a:ext cx="5486400" cy="6707500"/>
+                      <a:ext cx="5486400" cy="6655158"/>
                     </a:xfrm>
                     <a:prstGeom prst="rect"/>
                   </pic:spPr>
@@ -270,7 +270,7 @@
     </w:p>
     <w:sectPr>
       <w:pgSz w:w="15840" w:h="12240" w:orient="landscape"/>
-      <w:pgMar w:top="864" w:right="864" w:bottom="864" w:left="864" w:header="720" w:footer="720" w:gutter="0"/>
+      <w:pgMar w:top="720" w:right="720" w:bottom="720" w:left="720" w:header="720" w:footer="720" w:gutter="0"/>
       <w:cols w:space="720"/>
       <w:docGrid w:linePitch="360"/>
     </w:sectPr>

</xml_diff>

<commit_message>
Condense figure and caption to fit one page
Panel A trimmed to six sharper rows per side (tools for homogeneous vs
admixed cohorts replaces the cancer-cohort row); cohort cards gain solid
header bands in their own hue so the cancer stream reads first; the
cancer card now says diverse pediatric B-ALL cohorts including REDIAL
rather than listing array platforms and cohort abbreviations; benchmark
result text is bold and larger; step text shortened. Caption cut from
about 450 to 223 words, and the Word deliverable places figure and
caption together on one landscape page.

Co-Authored-By: Claude Opus 5 <noreply@anthropic.com>
Claude-Session: https://claude.ai/code/session_018QsH3eLkvymJ4uH9sH99fS
</commit_message>
<xml_diff>
--- a/docs/figures/pipeline_schematic_figure.docx
+++ b/docs/figures/pipeline_schematic_figure.docx
@@ -4,17 +4,12 @@
   <w:body>
     <w:p>
       <w:pPr>
-        <w:pStyle w:val="Heading1"/>
+        <w:spacing w:after="0"/>
       </w:pPr>
-      <w:r>
-        <w:t>Option 3: cancer application (benchmark + REDIAL/COG streams)</w:t>
-      </w:r>
-    </w:p>
-    <w:p>
       <w:r>
         <w:drawing>
           <wp:inline xmlns:a="http://schemas.openxmlformats.org/drawingml/2006/main" xmlns:pic="http://schemas.openxmlformats.org/drawingml/2006/picture">
-            <wp:extent cx="9144000" cy="5644800"/>
+            <wp:extent cx="9144000" cy="5490000"/>
             <wp:docPr id="1" name="Picture 1"/>
             <wp:cNvGraphicFramePr>
               <a:graphicFrameLocks noChangeAspect="1"/>
@@ -35,7 +30,7 @@
                   <pic:spPr>
                     <a:xfrm>
                       <a:off x="0" y="0"/>
-                      <a:ext cx="9144000" cy="5644800"/>
+                      <a:ext cx="9144000" cy="5490000"/>
                     </a:xfrm>
                     <a:prstGeom prst="rect"/>
                   </pic:spPr>
@@ -48,27 +43,27 @@
     </w:p>
     <w:p>
       <w:pPr>
-        <w:spacing w:after="120"/>
+        <w:spacing w:after="0" w:before="120"/>
       </w:pPr>
       <w:r>
         <w:rPr>
           <w:b w:val="0"/>
-          <w:sz w:val="18"/>
+          <w:sz w:val="17"/>
         </w:rPr>
       </w:r>
       <w:r>
         <w:rPr>
           <w:b/>
-          <w:sz w:val="18"/>
+          <w:sz w:val="17"/>
         </w:rPr>
-        <w:t>Figure 1. A modular, ancestry-aware framework for germline genotype harmonization and GWAS, benchmarked on public and simulated data and applied to outcome analysis in the REDIAL pediatric leukemia cohort.</w:t>
+        <w:t>Figure 1. A modular, ancestry-aware framework for germline genotype harmonization and GWAS, applied to pediatric B-cell acute lymphoblastic leukemia (B-ALL).</w:t>
       </w:r>
       <w:r>
         <w:rPr>
           <w:b w:val="0"/>
-          <w:sz w:val="18"/>
+          <w:sz w:val="17"/>
         </w:rPr>
-        <w:t xml:space="preserve"> (A) Key differences between a typical GWAS workflow and this framework, for genotype harmonization and for association and downstream analysis. (B) Genotype harmonization, imputation, quality control and ancestry inference. Two data streams enter the same pipeline: a benchmarking stream of 1000 Genomes samples genotyped on multiple SNP arrays with matched whole-genome sequencing (WGS) truth plus simulated phenotypes, and a pediatric acute lymphoblastic leukemia (ALL) stream comprising the REDIAL (Reducing Ethnic Disparities in Acute Leukemias) cohort on Illumina GSA v1/v2 arrays together with Children's Oncology Group and St. Jude cohorts on Affymetrix 500K and SNP6 arrays, a subset of which also has germline WGS. The default workflow applies light pre-imputation quality control, two-step imputation against the TOPMed, All of Us or Michigan reference panels, ancestry-aware MagicalRsq-X filtering in place of a fixed R² cut-off, and extensive post-imputation quality control before platform merging, followed by global (GRAF-anc) and local (RFMix) ancestry inference. Because local ancestry accuracy depends strongly on how closely the reference haplotypes match the population under study, users can supply their own population-matched reference panels at the local-ancestry step; the imputation step is written to accommodate additional public panels as they become available, such as South Asian-specific resources. There is no standardized genotype harmonization workflow, and published studies differ in the timing and stringency of quality control, in whether platforms are merged before or after imputation, in fixed R² versus recalibrated filtering, and in one- versus two-step imputation. Six such published workflows are therefore run head-to-head across platforms and scored by concordance with WGS truth within each ancestry group, by reference panel, by the gain in sites retained relative to standard practice, and by simulated GWAS power under varying ancestry-specific effect sizes, allele frequencies and heritabilities. This identifies the best-performing workflow for each genotyping platform, quantifies its improvement and computational cost within each ancestry group, including admixed cohorts, and shows which ancestry groups remain limited by the available reference populations (insets illustrative). (C) Ancestry-aware GWAS and downstream analysis. Harmonized genotypes are stratified into GRAF-anc ancestry groups and analysed per ancestry and trait with REGENIE, SAIGE, GENESIS or Tractor; because ancestry is estimated within the same framework, time-to-event GWAS can model local ancestry effects directly, enabling clinically relevant outcome analyses for overall survival, disease-free survival, relapse, minimal residual disease and treatment toxicity in diverse and admixed cohorts. Results are combined by MR-MEGA-env meta-regression, fine-mapped within and across ancestries and traits (PolyFun + SuSiE, MG-FLASH-FM), and carried into ancestry-aware polygenic scores, heritability, colocalization and annotation. Every step is an independent, containerized Nextflow entry point; dashed outlines mark optional steps. Together these components address a central obstacle to cancer genomic studies in diverse cohorts: array- and ancestry-dependent imputation loss that removes exactly the variants most informative in underrepresented populations, where risk alleles for minimal residual disease and relapse are often enriched. REDIAL provides an empirical, real-world test case linking the two halves of the framework: germline associations with minimal residual disease (IL15, GATA3) and relapse (PYGL, PDE4B) are already established and show marked differences in risk allele frequency across ancestry groups, so competing harmonization workflows can be judged by whether the resulting B-ALL outcome GWAS recover these signals. Panel C therefore closes with the REDIAL case example: for each outcome, the net gain in known and in novel loci detected is compared across harmonization workflows and ancestry groups, converting an upstream methodological choice into a measurable difference in discovery. This provides direct evidence for the value of ancestry-specific tools in admixed cohorts and an objective basis for extending the framework to other diverse cancer cohorts.</w:t>
+        <w:t xml:space="preserve"> (A) Key differences from a typical GWAS workflow, for harmonization and for association and downstream analysis. (B) Two data streams enter one pipeline: 1000 Genomes samples on multiple SNP arrays with matched whole-genome sequencing (WGS) truth plus simulated phenotypes, and diverse pediatric B-ALL cohorts including REDIAL (Reducing Ethnic Disparities in Acute Leukemias), a subset with paired array and germline WGS data. The default workflow applies light pre-imputation quality control, two-step imputation, ancestry-aware MagicalRsq-X filtering in place of a fixed R² cut-off, extensive post-imputation quality control, and global (GRAF-anc) plus local (RFMix) ancestry inference; population-matched reference panels can be supplied for local ancestry, where panel match strongly affects accuracy. Because no standardized harmonization workflow exists, six published workflows are run head-to-head and scored by concordance with WGS truth, reference panel, sites retained relative to standard practice, and simulated GWAS power, identifying the best workflow per platform and its gain and cost within each ancestry group (insets illustrative). (C) Harmonized genotypes are stratified by ancestry and analysed with REGENIE, SAIGE, GENESIS or Tractor, including time-to-event GWAS that models local ancestry effects (overall survival, disease-free survival, relapse, minimal residual disease, toxicity), then combined by MR-MEGA-env meta-regression, fine-mapped within and across ancestries and traits (PolyFun + SuSiE, MG-FLASH-FM), and carried into ancestry-aware polygenic scores, heritability, colocalization and annotation. REDIAL is the real-world test case: germline associations with minimal residual disease (IL15, GATA3) and relapse (PYGL, PDE4B) are established and differ in risk allele frequency across ancestries, so workflows are judged by the net gain in known and novel loci detected — converting an upstream methodological choice into measurable discovery in diverse and admixed cohorts. Every step is an independent, containerized Nextflow entry point; dashed outlines mark optional steps.</w:t>
       </w:r>
     </w:p>
     <w:p>
@@ -81,14 +76,14 @@
         <w:pStyle w:val="Heading1"/>
       </w:pPr>
       <w:r>
-        <w:t>Option 1: landscape (no cohort streams)</w:t>
+        <w:t>Alternative layout 1: landscape, no cohort streams</w:t>
       </w:r>
     </w:p>
     <w:p>
       <w:r>
         <w:drawing>
           <wp:inline xmlns:a="http://schemas.openxmlformats.org/drawingml/2006/main" xmlns:pic="http://schemas.openxmlformats.org/drawingml/2006/picture">
-            <wp:extent cx="9144000" cy="5951989"/>
+            <wp:extent cx="9144000" cy="5658374"/>
             <wp:docPr id="2" name="Picture 2"/>
             <wp:cNvGraphicFramePr>
               <a:graphicFrameLocks noChangeAspect="1"/>
@@ -109,7 +104,7 @@
                   <pic:spPr>
                     <a:xfrm>
                       <a:off x="0" y="0"/>
-                      <a:ext cx="9144000" cy="5951989"/>
+                      <a:ext cx="9144000" cy="5658374"/>
                     </a:xfrm>
                     <a:prstGeom prst="rect"/>
                   </pic:spPr>
@@ -122,99 +117,99 @@
     </w:p>
     <w:p>
       <w:pPr>
-        <w:spacing w:after="120"/>
+        <w:spacing w:after="0" w:before="120"/>
       </w:pPr>
       <w:r>
         <w:rPr>
           <w:b w:val="0"/>
-          <w:sz w:val="18"/>
+          <w:sz w:val="17"/>
         </w:rPr>
       </w:r>
       <w:r>
         <w:rPr>
           <w:b/>
-          <w:sz w:val="18"/>
+          <w:sz w:val="17"/>
         </w:rPr>
         <w:t>Figure 1. A modular, ancestry-aware framework for genotype harmonization and GWAS.</w:t>
       </w:r>
       <w:r>
         <w:rPr>
           <w:b w:val="0"/>
-          <w:sz w:val="18"/>
+          <w:sz w:val="17"/>
         </w:rPr>
       </w:r>
     </w:p>
     <w:p>
       <w:pPr>
-        <w:spacing w:after="120"/>
+        <w:spacing w:after="0" w:before="120"/>
       </w:pPr>
       <w:r>
         <w:rPr>
           <w:b w:val="0"/>
-          <w:sz w:val="18"/>
+          <w:sz w:val="17"/>
         </w:rPr>
       </w:r>
       <w:r>
         <w:rPr>
           <w:b/>
-          <w:sz w:val="18"/>
+          <w:sz w:val="17"/>
         </w:rPr>
         <w:t>(A)</w:t>
       </w:r>
       <w:r>
         <w:rPr>
           <w:b w:val="0"/>
-          <w:sz w:val="18"/>
+          <w:sz w:val="17"/>
         </w:rPr>
         <w:t xml:space="preserve"> Key differences from a typical GWAS workflow, for genotype harmonization and for association and downstream analysis.</w:t>
       </w:r>
     </w:p>
     <w:p>
       <w:pPr>
-        <w:spacing w:after="120"/>
+        <w:spacing w:after="0" w:before="120"/>
       </w:pPr>
       <w:r>
         <w:rPr>
           <w:b w:val="0"/>
-          <w:sz w:val="18"/>
+          <w:sz w:val="17"/>
         </w:rPr>
       </w:r>
       <w:r>
         <w:rPr>
           <w:b/>
-          <w:sz w:val="18"/>
+          <w:sz w:val="17"/>
         </w:rPr>
         <w:t>(B)</w:t>
       </w:r>
       <w:r>
         <w:rPr>
           <w:b w:val="0"/>
-          <w:sz w:val="18"/>
+          <w:sz w:val="17"/>
         </w:rPr>
         <w:t xml:space="preserve"> Genotype harmonization, QC and ancestry inference (Nextflow_Genotype_Pipeline). Genotypes from multiple arrays, batches and genome builds are lifted over, aligned and union-merged, imputed on the TOPMed, Michigan and All of Us servers through automated job handling, filtered with the ancestry-aware MagicalRsq-X metric instead of a fixed R² cut-off, merged and passed through final QC. Global ancestry (GRAF-anc) and local ancestry tracts (RFMix) are inferred, and an optional benchmarking module compares imputed genotypes with whole-genome sequencing truth and simulates GWAS power by ancestry (insets illustrative).</w:t>
       </w:r>
     </w:p>
     <w:p>
       <w:pPr>
-        <w:spacing w:after="120"/>
+        <w:spacing w:after="0" w:before="120"/>
       </w:pPr>
       <w:r>
         <w:rPr>
           <w:b w:val="0"/>
-          <w:sz w:val="18"/>
+          <w:sz w:val="17"/>
         </w:rPr>
       </w:r>
       <w:r>
         <w:rPr>
           <w:b/>
-          <w:sz w:val="18"/>
+          <w:sz w:val="17"/>
         </w:rPr>
         <w:t>(C)</w:t>
       </w:r>
       <w:r>
         <w:rPr>
           <w:b w:val="0"/>
-          <w:sz w:val="18"/>
+          <w:sz w:val="17"/>
         </w:rPr>
         <w:t xml:space="preserve"> Ancestry-aware GWAS and downstream analyses (Nextflow_GWAS_pipeline). Harmonized genotypes are stratified into GRAF-anc ancestry groups, which resolve finer than continental labels and include Amerindigenous and admixed groups, and analysed in parallel per ancestry and trait with REGENIE, SAIGE, GENESIS or Tractor, including time-to-event GWAS that incorporates local ancestry. Group results are combined by MR-MEGA-env meta-regression, which models ancestry-related and cohort-specific heterogeneity, fine-mapped within ancestry (PolyFun + SuSiE) and across traits and ancestries (MG-FLASH-FM for related traits), and carried into ancestry-aware polygenic scores, heritability, colocalization and functional annotation. Every step is an independent Nextflow entry point, so the framework runs end to end or step by step; dashed outlines mark optional steps.</w:t>
       </w:r>
@@ -229,14 +224,14 @@
         <w:pStyle w:val="Heading1"/>
       </w:pPr>
       <w:r>
-        <w:t>Option 2: portrait</w:t>
+        <w:t>Alternative layout 2: portrait</w:t>
       </w:r>
     </w:p>
     <w:p>
       <w:r>
         <w:drawing>
           <wp:inline xmlns:a="http://schemas.openxmlformats.org/drawingml/2006/main" xmlns:pic="http://schemas.openxmlformats.org/drawingml/2006/picture">
-            <wp:extent cx="5486400" cy="6655158"/>
+            <wp:extent cx="5303520" cy="5997584"/>
             <wp:docPr id="3" name="Picture 3"/>
             <wp:cNvGraphicFramePr>
               <a:graphicFrameLocks noChangeAspect="1"/>
@@ -257,7 +252,7 @@
                   <pic:spPr>
                     <a:xfrm>
                       <a:off x="0" y="0"/>
-                      <a:ext cx="5486400" cy="6655158"/>
+                      <a:ext cx="5303520" cy="5997584"/>
                     </a:xfrm>
                     <a:prstGeom prst="rect"/>
                   </pic:spPr>
@@ -270,7 +265,7 @@
     </w:p>
     <w:sectPr>
       <w:pgSz w:w="15840" w:h="12240" w:orient="landscape"/>
-      <w:pgMar w:top="720" w:right="720" w:bottom="720" w:left="720" w:header="720" w:footer="720" w:gutter="0"/>
+      <w:pgMar w:top="576" w:right="648" w:bottom="576" w:left="648" w:header="720" w:footer="720" w:gutter="0"/>
       <w:cols w:space="720"/>
       <w:docGrid w:linePitch="360"/>
     </w:sectPr>

</xml_diff>

<commit_message>
Use REDIAL genotyping count of 1,870
The cancer cohort card and caption now report REDIAL n = 1,870
genotyped alongside additional multi-site cohorts, replacing the
placeholder combined count.

Co-Authored-By: Claude Opus 5 <noreply@anthropic.com>
Claude-Session: https://claude.ai/code/session_018QsH3eLkvymJ4uH9sH99fS
</commit_message>
<xml_diff>
--- a/docs/figures/pipeline_schematic_figure.docx
+++ b/docs/figures/pipeline_schematic_figure.docx
@@ -9,7 +9,7 @@
       <w:r>
         <w:drawing>
           <wp:inline xmlns:a="http://schemas.openxmlformats.org/drawingml/2006/main" xmlns:pic="http://schemas.openxmlformats.org/drawingml/2006/picture">
-            <wp:extent cx="9144000" cy="5490000"/>
+            <wp:extent cx="9144000" cy="5504400"/>
             <wp:docPr id="1" name="Picture 1"/>
             <wp:cNvGraphicFramePr>
               <a:graphicFrameLocks noChangeAspect="1"/>
@@ -30,7 +30,7 @@
                   <pic:spPr>
                     <a:xfrm>
                       <a:off x="0" y="0"/>
-                      <a:ext cx="9144000" cy="5490000"/>
+                      <a:ext cx="9144000" cy="5504400"/>
                     </a:xfrm>
                     <a:prstGeom prst="rect"/>
                   </pic:spPr>
@@ -63,7 +63,7 @@
           <w:b w:val="0"/>
           <w:sz w:val="17"/>
         </w:rPr>
-        <w:t xml:space="preserve"> (A) Key differences from a typical GWAS workflow, for harmonization and for association and downstream analysis. (B) Two data streams enter one pipeline: 1000 Genomes samples on multiple SNP arrays with matched whole-genome sequencing (WGS) truth plus simulated phenotypes, and diverse pediatric B-ALL cohorts including REDIAL (Reducing Ethnic Disparities in Acute Leukemias), a subset with paired array and germline WGS data. The default workflow applies light pre-imputation quality control, two-step imputation, ancestry-aware MagicalRsq-X filtering in place of a fixed R² cut-off, extensive post-imputation quality control, and global (GRAF-anc) plus local (RFMix) ancestry inference; population-matched reference panels can be supplied for local ancestry, where panel match strongly affects accuracy. Because no standardized harmonization workflow exists, six published workflows are run head-to-head and scored by concordance with WGS truth, reference panel, sites retained relative to standard practice, and simulated GWAS power, identifying the best workflow per platform and its gain and cost within each ancestry group (insets illustrative). (C) Harmonized genotypes are stratified by ancestry and analysed with REGENIE, SAIGE, GENESIS or Tractor, including time-to-event GWAS that models local ancestry effects (overall survival, disease-free survival, relapse, minimal residual disease, toxicity), then combined by MR-MEGA-env meta-regression, fine-mapped within and across ancestries and traits (PolyFun + SuSiE, MG-FLASH-FM), and carried into ancestry-aware polygenic scores, heritability, colocalization and annotation. REDIAL is the real-world test case: germline associations with minimal residual disease (IL15, GATA3) and relapse (PYGL, PDE4B) are established and differ in risk allele frequency across ancestries, so workflows are judged by the net gain in known and novel loci detected — converting an upstream methodological choice into measurable discovery in diverse and admixed cohorts. Every step is an independent, containerized Nextflow entry point; dashed outlines mark optional steps.</w:t>
+        <w:t xml:space="preserve"> (A) Key differences from a typical GWAS workflow, for harmonization and for association and downstream analysis. (B) Two data streams enter one pipeline: 1000 Genomes samples on multiple SNP arrays with matched whole-genome sequencing (WGS) truth plus simulated phenotypes, and diverse pediatric B-ALL cohorts comprising REDIAL (Reducing Ethnic Disparities in Acute Leukemias; n = 1,870 with genotyping) and additional multi-site cohorts, a subset with paired array and germline WGS data. The default workflow applies light pre-imputation quality control, two-step imputation, ancestry-aware MagicalRsq-X filtering in place of a fixed R² cut-off, extensive post-imputation quality control, and global (GRAF-anc) plus local (RFMix) ancestry inference; population-matched reference panels can be supplied for local ancestry, where panel match strongly affects accuracy. Because no standardized harmonization workflow exists, six published workflows are run head-to-head and scored by concordance with WGS truth, reference panel, sites retained relative to standard practice, and simulated GWAS power, identifying the best workflow per platform and its gain and cost within each ancestry group (insets illustrative). (C) Harmonized genotypes are stratified by ancestry and analysed with REGENIE, SAIGE, GENESIS or Tractor, including time-to-event GWAS that models local ancestry effects (overall survival, disease-free survival, relapse, minimal residual disease, toxicity), then combined by MR-MEGA-env meta-regression, fine-mapped within and across ancestries and traits (PolyFun + SuSiE, MG-FLASH-FM), and carried into ancestry-aware polygenic scores, heritability, colocalization and annotation. REDIAL is the real-world test case: germline associations with minimal residual disease (IL15, GATA3) and relapse (PYGL, PDE4B) are established and differ in risk allele frequency across ancestries, so workflows are judged by the net gain in known and novel loci detected — converting an upstream methodological choice into measurable discovery in diverse and admixed cohorts. Every step is an independent, containerized Nextflow entry point; dashed outlines mark optional steps.</w:t>
       </w:r>
     </w:p>
     <w:p>

</xml_diff>

<commit_message>
Refine schematic: warm Panel A, realistic Manhattan, rebalanced cards
Panel A gets a peach tint with an orange frame and larger bold text in
all three columns; cohort header bands are taller; the illustrative tag
is removed; the benchmark card widens for larger insets while the result
card narrows and now reads "improvement metrics per ancestry"; the REDIAL
card is simplified to one wide, properly drawn Manhattan with labelled
loci plus a net-gain chart; canvas widened to keep a one-page aspect.

Co-Authored-By: Claude Fable 5.1 <noreply@anthropic.com>
Claude-Session: https://claude.ai/code/session_018QsH3eLkvymJ4uH9sH99fS
</commit_message>
<xml_diff>
--- a/docs/figures/pipeline_schematic_figure.docx
+++ b/docs/figures/pipeline_schematic_figure.docx
@@ -9,7 +9,7 @@
       <w:r>
         <w:drawing>
           <wp:inline xmlns:a="http://schemas.openxmlformats.org/drawingml/2006/main" xmlns:pic="http://schemas.openxmlformats.org/drawingml/2006/picture">
-            <wp:extent cx="9144000" cy="5504400"/>
+            <wp:extent cx="9144000" cy="5449147"/>
             <wp:docPr id="1" name="Picture 1"/>
             <wp:cNvGraphicFramePr>
               <a:graphicFrameLocks noChangeAspect="1"/>
@@ -30,7 +30,7 @@
                   <pic:spPr>
                     <a:xfrm>
                       <a:off x="0" y="0"/>
-                      <a:ext cx="9144000" cy="5504400"/>
+                      <a:ext cx="9144000" cy="5449147"/>
                     </a:xfrm>
                     <a:prstGeom prst="rect"/>
                   </pic:spPr>
@@ -83,7 +83,7 @@
       <w:r>
         <w:drawing>
           <wp:inline xmlns:a="http://schemas.openxmlformats.org/drawingml/2006/main" xmlns:pic="http://schemas.openxmlformats.org/drawingml/2006/picture">
-            <wp:extent cx="9144000" cy="5658374"/>
+            <wp:extent cx="9144000" cy="5729681"/>
             <wp:docPr id="2" name="Picture 2"/>
             <wp:cNvGraphicFramePr>
               <a:graphicFrameLocks noChangeAspect="1"/>
@@ -104,7 +104,7 @@
                   <pic:spPr>
                     <a:xfrm>
                       <a:off x="0" y="0"/>
-                      <a:ext cx="9144000" cy="5658374"/>
+                      <a:ext cx="9144000" cy="5729681"/>
                     </a:xfrm>
                     <a:prstGeom prst="rect"/>
                   </pic:spPr>
@@ -231,7 +231,7 @@
       <w:r>
         <w:drawing>
           <wp:inline xmlns:a="http://schemas.openxmlformats.org/drawingml/2006/main" xmlns:pic="http://schemas.openxmlformats.org/drawingml/2006/picture">
-            <wp:extent cx="5303520" cy="5997584"/>
+            <wp:extent cx="5303520" cy="6131417"/>
             <wp:docPr id="3" name="Picture 3"/>
             <wp:cNvGraphicFramePr>
               <a:graphicFrameLocks noChangeAspect="1"/>
@@ -252,7 +252,7 @@
                   <pic:spPr>
                     <a:xfrm>
                       <a:off x="0" y="0"/>
-                      <a:ext cx="5303520" cy="5997584"/>
+                      <a:ext cx="5303520" cy="6131417"/>
                     </a:xfrm>
                     <a:prstGeom prst="rect"/>
                   </pic:spPr>

</xml_diff>

<commit_message>
Light blue Panel A field; roomier chart insets
Panel A background is now light blue with a blue frame. The benchmark
card and REDIAL card widen and grow so the bar charts, Manhattan plot
and net-gain chart have more space; canvas widened to hold the aspect.

Co-Authored-By: Claude Fable 5.1 <noreply@anthropic.com>
Claude-Session: https://claude.ai/code/session_018QsH3eLkvymJ4uH9sH99fS
</commit_message>
<xml_diff>
--- a/docs/figures/pipeline_schematic_figure.docx
+++ b/docs/figures/pipeline_schematic_figure.docx
@@ -9,7 +9,7 @@
       <w:r>
         <w:drawing>
           <wp:inline xmlns:a="http://schemas.openxmlformats.org/drawingml/2006/main" xmlns:pic="http://schemas.openxmlformats.org/drawingml/2006/picture">
-            <wp:extent cx="9144000" cy="5449147"/>
+            <wp:extent cx="9052560" cy="5336579"/>
             <wp:docPr id="1" name="Picture 1"/>
             <wp:cNvGraphicFramePr>
               <a:graphicFrameLocks noChangeAspect="1"/>
@@ -30,7 +30,7 @@
                   <pic:spPr>
                     <a:xfrm>
                       <a:off x="0" y="0"/>
-                      <a:ext cx="9144000" cy="5449147"/>
+                      <a:ext cx="9052560" cy="5336579"/>
                     </a:xfrm>
                     <a:prstGeom prst="rect"/>
                   </pic:spPr>
@@ -43,25 +43,25 @@
     </w:p>
     <w:p>
       <w:pPr>
-        <w:spacing w:after="0" w:before="120"/>
+        <w:spacing w:after="0" w:before="100"/>
       </w:pPr>
       <w:r>
         <w:rPr>
           <w:b w:val="0"/>
-          <w:sz w:val="17"/>
+          <w:sz w:val="16"/>
         </w:rPr>
       </w:r>
       <w:r>
         <w:rPr>
           <w:b/>
-          <w:sz w:val="17"/>
+          <w:sz w:val="16"/>
         </w:rPr>
         <w:t>Figure 1. A modular, ancestry-aware framework for germline genotype harmonization and GWAS, applied to pediatric B-cell acute lymphoblastic leukemia (B-ALL).</w:t>
       </w:r>
       <w:r>
         <w:rPr>
           <w:b w:val="0"/>
-          <w:sz w:val="17"/>
+          <w:sz w:val="16"/>
         </w:rPr>
         <w:t xml:space="preserve"> (A) Key differences from a typical GWAS workflow, for harmonization and for association and downstream analysis. (B) Two data streams enter one pipeline: 1000 Genomes samples on multiple SNP arrays with matched whole-genome sequencing (WGS) truth plus simulated phenotypes, and diverse pediatric B-ALL cohorts comprising REDIAL (Reducing Ethnic Disparities in Acute Leukemias; n = 1,870 with genotyping) and additional multi-site cohorts, a subset with paired array and germline WGS data. The default workflow applies light pre-imputation quality control, two-step imputation, ancestry-aware MagicalRsq-X filtering in place of a fixed R² cut-off, extensive post-imputation quality control, and global (GRAF-anc) plus local (RFMix) ancestry inference; population-matched reference panels can be supplied for local ancestry, where panel match strongly affects accuracy. Because no standardized harmonization workflow exists, six published workflows are run head-to-head and scored by concordance with WGS truth, reference panel, sites retained relative to standard practice, and simulated GWAS power, identifying the best workflow per platform and its gain and cost within each ancestry group (insets illustrative). (C) Harmonized genotypes are stratified by ancestry and analysed with REGENIE, SAIGE, GENESIS or Tractor, including time-to-event GWAS that models local ancestry effects (overall survival, disease-free survival, relapse, minimal residual disease, toxicity), then combined by MR-MEGA-env meta-regression, fine-mapped within and across ancestries and traits (PolyFun + SuSiE, MG-FLASH-FM), and carried into ancestry-aware polygenic scores, heritability, colocalization and annotation. REDIAL is the real-world test case: germline associations with minimal residual disease (IL15, GATA3) and relapse (PYGL, PDE4B) are established and differ in risk allele frequency across ancestries, so workflows are judged by the net gain in known and novel loci detected — converting an upstream methodological choice into measurable discovery in diverse and admixed cohorts. Every step is an independent, containerized Nextflow entry point; dashed outlines mark optional steps.</w:t>
       </w:r>
@@ -83,7 +83,7 @@
       <w:r>
         <w:drawing>
           <wp:inline xmlns:a="http://schemas.openxmlformats.org/drawingml/2006/main" xmlns:pic="http://schemas.openxmlformats.org/drawingml/2006/picture">
-            <wp:extent cx="9144000" cy="5729681"/>
+            <wp:extent cx="9052560" cy="5838486"/>
             <wp:docPr id="2" name="Picture 2"/>
             <wp:cNvGraphicFramePr>
               <a:graphicFrameLocks noChangeAspect="1"/>
@@ -104,7 +104,7 @@
                   <pic:spPr>
                     <a:xfrm>
                       <a:off x="0" y="0"/>
-                      <a:ext cx="9144000" cy="5729681"/>
+                      <a:ext cx="9052560" cy="5838486"/>
                     </a:xfrm>
                     <a:prstGeom prst="rect"/>
                   </pic:spPr>
@@ -117,7 +117,7 @@
     </w:p>
     <w:p>
       <w:pPr>
-        <w:spacing w:after="0" w:before="120"/>
+        <w:spacing w:after="0" w:before="100"/>
       </w:pPr>
       <w:r>
         <w:rPr>
@@ -141,7 +141,7 @@
     </w:p>
     <w:p>
       <w:pPr>
-        <w:spacing w:after="0" w:before="120"/>
+        <w:spacing w:after="0" w:before="100"/>
       </w:pPr>
       <w:r>
         <w:rPr>
@@ -166,7 +166,7 @@
     </w:p>
     <w:p>
       <w:pPr>
-        <w:spacing w:after="0" w:before="120"/>
+        <w:spacing w:after="0" w:before="100"/>
       </w:pPr>
       <w:r>
         <w:rPr>
@@ -191,7 +191,7 @@
     </w:p>
     <w:p>
       <w:pPr>
-        <w:spacing w:after="0" w:before="120"/>
+        <w:spacing w:after="0" w:before="100"/>
       </w:pPr>
       <w:r>
         <w:rPr>
@@ -231,7 +231,7 @@
       <w:r>
         <w:drawing>
           <wp:inline xmlns:a="http://schemas.openxmlformats.org/drawingml/2006/main" xmlns:pic="http://schemas.openxmlformats.org/drawingml/2006/picture">
-            <wp:extent cx="5303520" cy="6131417"/>
+            <wp:extent cx="5303520" cy="6318161"/>
             <wp:docPr id="3" name="Picture 3"/>
             <wp:cNvGraphicFramePr>
               <a:graphicFrameLocks noChangeAspect="1"/>
@@ -252,7 +252,7 @@
                   <pic:spPr>
                     <a:xfrm>
                       <a:off x="0" y="0"/>
-                      <a:ext cx="5303520" cy="6131417"/>
+                      <a:ext cx="5303520" cy="6318161"/>
                     </a:xfrm>
                     <a:prstGeom prst="rect"/>
                   </pic:spPr>
@@ -265,7 +265,7 @@
     </w:p>
     <w:sectPr>
       <w:pgSz w:w="15840" w:h="12240" w:orient="landscape"/>
-      <w:pgMar w:top="576" w:right="648" w:bottom="576" w:left="648" w:header="720" w:footer="720" w:gutter="0"/>
+      <w:pgMar w:top="504" w:right="720" w:bottom="504" w:left="720" w:header="720" w:footer="720" w:gutter="0"/>
       <w:cols w:space="720"/>
       <w:docGrid w:linePitch="360"/>
     </w:sectPr>

</xml_diff>

<commit_message>
Restore pastel step palette; Panel A tables without a frame
Step cards return to the mint / orange / pink / green / purple / blue
palette with ink titles; benchmark insets use grey, blue and green.
Panel A drops its background frame so the two tables sit directly on
the page with larger rows and text.

Co-Authored-By: Claude Fable 5.1 <noreply@anthropic.com>
Claude-Session: https://claude.ai/code/session_018QsH3eLkvymJ4uH9sH99fS
</commit_message>
<xml_diff>
--- a/docs/figures/pipeline_schematic_figure.docx
+++ b/docs/figures/pipeline_schematic_figure.docx
@@ -9,7 +9,7 @@
       <w:r>
         <w:drawing>
           <wp:inline xmlns:a="http://schemas.openxmlformats.org/drawingml/2006/main" xmlns:pic="http://schemas.openxmlformats.org/drawingml/2006/picture">
-            <wp:extent cx="9052560" cy="5336579"/>
+            <wp:extent cx="9052560" cy="5399884"/>
             <wp:docPr id="1" name="Picture 1"/>
             <wp:cNvGraphicFramePr>
               <a:graphicFrameLocks noChangeAspect="1"/>
@@ -30,7 +30,7 @@
                   <pic:spPr>
                     <a:xfrm>
                       <a:off x="0" y="0"/>
-                      <a:ext cx="9052560" cy="5336579"/>
+                      <a:ext cx="9052560" cy="5399884"/>
                     </a:xfrm>
                     <a:prstGeom prst="rect"/>
                   </pic:spPr>
@@ -83,7 +83,7 @@
       <w:r>
         <w:drawing>
           <wp:inline xmlns:a="http://schemas.openxmlformats.org/drawingml/2006/main" xmlns:pic="http://schemas.openxmlformats.org/drawingml/2006/picture">
-            <wp:extent cx="9052560" cy="5838486"/>
+            <wp:extent cx="9052560" cy="5921537"/>
             <wp:docPr id="2" name="Picture 2"/>
             <wp:cNvGraphicFramePr>
               <a:graphicFrameLocks noChangeAspect="1"/>
@@ -104,7 +104,7 @@
                   <pic:spPr>
                     <a:xfrm>
                       <a:off x="0" y="0"/>
-                      <a:ext cx="9052560" cy="5838486"/>
+                      <a:ext cx="9052560" cy="5921537"/>
                     </a:xfrm>
                     <a:prstGeom prst="rect"/>
                   </pic:spPr>
@@ -231,7 +231,7 @@
       <w:r>
         <w:drawing>
           <wp:inline xmlns:a="http://schemas.openxmlformats.org/drawingml/2006/main" xmlns:pic="http://schemas.openxmlformats.org/drawingml/2006/picture">
-            <wp:extent cx="5303520" cy="6318161"/>
+            <wp:extent cx="5303520" cy="6486230"/>
             <wp:docPr id="3" name="Picture 3"/>
             <wp:cNvGraphicFramePr>
               <a:graphicFrameLocks noChangeAspect="1"/>
@@ -252,7 +252,7 @@
                   <pic:spPr>
                     <a:xfrm>
                       <a:off x="0" y="0"/>
-                      <a:ext cx="5303520" cy="6318161"/>
+                      <a:ext cx="5303520" cy="6486230"/>
                     </a:xfrm>
                     <a:prstGeom prst="rect"/>
                   </pic:spPr>

</xml_diff>

<commit_message>
Give Panel B and C headings room from the frame edge
Panel headings move down inside their frames and the frames gain
matching bottom padding.

Co-Authored-By: Claude Fable 5.1 <noreply@anthropic.com>
Claude-Session: https://claude.ai/code/session_018QsH3eLkvymJ4uH9sH99fS
</commit_message>
<xml_diff>
--- a/docs/figures/pipeline_schematic_figure.docx
+++ b/docs/figures/pipeline_schematic_figure.docx
@@ -9,7 +9,7 @@
       <w:r>
         <w:drawing>
           <wp:inline xmlns:a="http://schemas.openxmlformats.org/drawingml/2006/main" xmlns:pic="http://schemas.openxmlformats.org/drawingml/2006/picture">
-            <wp:extent cx="9052560" cy="5399884"/>
+            <wp:extent cx="8869680" cy="5439657"/>
             <wp:docPr id="1" name="Picture 1"/>
             <wp:cNvGraphicFramePr>
               <a:graphicFrameLocks noChangeAspect="1"/>
@@ -30,7 +30,7 @@
                   <pic:spPr>
                     <a:xfrm>
                       <a:off x="0" y="0"/>
-                      <a:ext cx="9052560" cy="5399884"/>
+                      <a:ext cx="8869680" cy="5439657"/>
                     </a:xfrm>
                     <a:prstGeom prst="rect"/>
                   </pic:spPr>
@@ -83,7 +83,7 @@
       <w:r>
         <w:drawing>
           <wp:inline xmlns:a="http://schemas.openxmlformats.org/drawingml/2006/main" xmlns:pic="http://schemas.openxmlformats.org/drawingml/2006/picture">
-            <wp:extent cx="9052560" cy="5921537"/>
+            <wp:extent cx="9052560" cy="6120859"/>
             <wp:docPr id="2" name="Picture 2"/>
             <wp:cNvGraphicFramePr>
               <a:graphicFrameLocks noChangeAspect="1"/>
@@ -104,7 +104,7 @@
                   <pic:spPr>
                     <a:xfrm>
                       <a:off x="0" y="0"/>
-                      <a:ext cx="9052560" cy="5921537"/>
+                      <a:ext cx="9052560" cy="6120859"/>
                     </a:xfrm>
                     <a:prstGeom prst="rect"/>
                   </pic:spPr>

</xml_diff>